<commit_message>
igual que el commit anterior, no se que paso
</commit_message>
<xml_diff>
--- a/Conceptos.docx
+++ b/Conceptos.docx
@@ -176,6 +176,9 @@
         <w:ind w:left="708"/>
       </w:pPr>
       <w:r>
+        <w:rPr>
+          <w:noProof/>
+        </w:rPr>
         <w:drawing>
           <wp:inline distT="0" distB="0" distL="0" distR="0" wp14:anchorId="31DF16DC" wp14:editId="44534FCB">
             <wp:extent cx="5400040" cy="1047750"/>
@@ -505,15 +508,7 @@
       </w:r>
       <w:proofErr w:type="spellEnd"/>
       <w:r>
-        <w:t xml:space="preserve">/panel </w:t>
-      </w:r>
-      <w:proofErr w:type="spellStart"/>
-      <w:r>
-        <w:t>y</w:t>
-      </w:r>
-      <w:proofErr w:type="spellEnd"/>
-      <w:r>
-        <w:t xml:space="preserve"> Integrante 3 en </w:t>
+        <w:t xml:space="preserve">/panel y Integrante 3 en </w:t>
       </w:r>
       <w:proofErr w:type="spellStart"/>
       <w:r>
@@ -556,6 +551,9 @@
         <w:ind w:left="708"/>
       </w:pPr>
       <w:r>
+        <w:rPr>
+          <w:noProof/>
+        </w:rPr>
         <w:drawing>
           <wp:inline distT="0" distB="0" distL="0" distR="0" wp14:anchorId="2C555205" wp14:editId="3CD4D5A0">
             <wp:extent cx="5400040" cy="2014220"/>
@@ -702,6 +700,9 @@
         <w:ind w:left="708"/>
       </w:pPr>
       <w:r>
+        <w:rPr>
+          <w:noProof/>
+        </w:rPr>
         <w:drawing>
           <wp:inline distT="0" distB="0" distL="0" distR="0" wp14:anchorId="61A07101" wp14:editId="228ACE52">
             <wp:extent cx="5400040" cy="1824990"/>
@@ -844,6 +845,9 @@
         <w:ind w:left="708"/>
       </w:pPr>
       <w:r>
+        <w:rPr>
+          <w:noProof/>
+        </w:rPr>
         <w:drawing>
           <wp:inline distT="0" distB="0" distL="0" distR="0" wp14:anchorId="58911186" wp14:editId="26C5AB9D">
             <wp:extent cx="5400040" cy="3053715"/>
@@ -881,6 +885,9 @@
         </w:drawing>
       </w:r>
       <w:r>
+        <w:rPr>
+          <w:noProof/>
+        </w:rPr>
         <w:drawing>
           <wp:inline distT="0" distB="0" distL="0" distR="0" wp14:anchorId="7C50DBC5" wp14:editId="16A090FE">
             <wp:extent cx="5400040" cy="1447165"/>
@@ -923,6 +930,9 @@
         <w:ind w:left="708"/>
       </w:pPr>
       <w:r>
+        <w:rPr>
+          <w:noProof/>
+        </w:rPr>
         <w:lastRenderedPageBreak/>
         <w:drawing>
           <wp:inline distT="0" distB="0" distL="0" distR="0" wp14:anchorId="739AACD3" wp14:editId="543C2D67">
@@ -1344,6 +1354,9 @@
     </w:p>
     <w:p>
       <w:r>
+        <w:rPr>
+          <w:noProof/>
+        </w:rPr>
         <w:drawing>
           <wp:inline distT="0" distB="0" distL="0" distR="0" wp14:anchorId="3CF8B521" wp14:editId="7518B8DD">
             <wp:extent cx="5400040" cy="2397760"/>
@@ -1384,6 +1397,9 @@
         <w:br/>
       </w:r>
       <w:r>
+        <w:rPr>
+          <w:noProof/>
+        </w:rPr>
         <w:drawing>
           <wp:inline distT="0" distB="0" distL="0" distR="0" wp14:anchorId="1F528139" wp14:editId="0CDEC624">
             <wp:extent cx="5400040" cy="2336165"/>
@@ -1423,6 +1439,9 @@
     </w:p>
     <w:p>
       <w:r>
+        <w:rPr>
+          <w:noProof/>
+        </w:rPr>
         <w:drawing>
           <wp:inline distT="0" distB="0" distL="0" distR="0" wp14:anchorId="6FB8C4B7" wp14:editId="7310706B">
             <wp:extent cx="5400040" cy="1835150"/>
@@ -1602,6 +1621,356 @@
         <w:t>]</w:t>
       </w:r>
     </w:p>
+    <w:p/>
+    <w:p>
+      <w:pPr>
+        <w:jc w:val="center"/>
+        <w:rPr>
+          <w:b/>
+          <w:bCs/>
+        </w:rPr>
+      </w:pPr>
+      <w:r>
+        <w:rPr>
+          <w:b/>
+          <w:bCs/>
+        </w:rPr>
+        <w:t>IMPLEMENTACION DEL ROUTER:</w:t>
+      </w:r>
+    </w:p>
+    <w:p>
+      <w:proofErr w:type="gramStart"/>
+      <w:r>
+        <w:t>Para que sirve?</w:t>
+      </w:r>
+      <w:proofErr w:type="gramEnd"/>
+      <w:r>
+        <w:t xml:space="preserve"> </w:t>
+      </w:r>
+      <w:r>
+        <w:t>se carga una sola vez y, a partir de ahí, JavaScript se encarga de cambiar lo que se ve en pantalla sin</w:t>
+      </w:r>
+    </w:p>
+    <w:p>
+      <w:r>
+        <w:t xml:space="preserve">recargar. A esto se lo llama SPA (Single Page </w:t>
+      </w:r>
+      <w:proofErr w:type="spellStart"/>
+      <w:r>
+        <w:t>Application</w:t>
+      </w:r>
+      <w:proofErr w:type="spellEnd"/>
+      <w:r>
+        <w:t xml:space="preserve"> </w:t>
+      </w:r>
+      <w:r>
+        <w:t>"aplicación de una sola página").</w:t>
+      </w:r>
+    </w:p>
+    <w:p>
+      <w:r>
+        <w:t xml:space="preserve">Por ejemplo en </w:t>
+      </w:r>
+      <w:proofErr w:type="spellStart"/>
+      <w:r>
+        <w:t>layoutpublico</w:t>
+      </w:r>
+      <w:proofErr w:type="spellEnd"/>
+      <w:r>
+        <w:t>, estábamos usando {</w:t>
+      </w:r>
+      <w:proofErr w:type="spellStart"/>
+      <w:r>
+        <w:t>children</w:t>
+      </w:r>
+      <w:proofErr w:type="spellEnd"/>
+      <w:r>
+        <w:t xml:space="preserve">} para mostrar contenido, ahora esto cambia, y pasamos a </w:t>
+      </w:r>
+      <w:proofErr w:type="gramStart"/>
+      <w:r>
+        <w:t>usar(</w:t>
+      </w:r>
+      <w:proofErr w:type="gramEnd"/>
+      <w:r>
+        <w:t>hay que importarlo) el componente {outlet}</w:t>
+      </w:r>
+    </w:p>
+    <w:p>
+      <w:r>
+        <w:t>Y Donde iba {</w:t>
+      </w:r>
+      <w:proofErr w:type="spellStart"/>
+      <w:r>
+        <w:t>children</w:t>
+      </w:r>
+      <w:proofErr w:type="spellEnd"/>
+      <w:r>
+        <w:t xml:space="preserve">}, entre </w:t>
+      </w:r>
+      <w:proofErr w:type="spellStart"/>
+      <w:r>
+        <w:t>nav</w:t>
+      </w:r>
+      <w:proofErr w:type="spellEnd"/>
+      <w:r>
+        <w:t xml:space="preserve"> y </w:t>
+      </w:r>
+      <w:proofErr w:type="spellStart"/>
+      <w:r>
+        <w:t>foot</w:t>
+      </w:r>
+      <w:proofErr w:type="spellEnd"/>
+      <w:r>
+        <w:t>, ahora va &lt;Outlet /&gt;</w:t>
+      </w:r>
+    </w:p>
+    <w:p/>
+    <w:p>
+      <w:proofErr w:type="gramStart"/>
+      <w:r>
+        <w:lastRenderedPageBreak/>
+        <w:t>Como se aplica?</w:t>
+      </w:r>
+      <w:proofErr w:type="gramEnd"/>
+    </w:p>
+    <w:p>
+      <w:r>
+        <w:t xml:space="preserve">Lo primero es en </w:t>
+      </w:r>
+      <w:proofErr w:type="spellStart"/>
+      <w:proofErr w:type="gramStart"/>
+      <w:r>
+        <w:t>app.jsx</w:t>
+      </w:r>
+      <w:proofErr w:type="spellEnd"/>
+      <w:r>
+        <w:t xml:space="preserve">  importar</w:t>
+      </w:r>
+      <w:proofErr w:type="gramEnd"/>
+      <w:r>
+        <w:t xml:space="preserve"> </w:t>
+      </w:r>
+      <w:proofErr w:type="spellStart"/>
+      <w:r>
+        <w:t>routerprovider</w:t>
+      </w:r>
+      <w:proofErr w:type="spellEnd"/>
+      <w:r>
+        <w:t xml:space="preserve"> y </w:t>
+      </w:r>
+      <w:proofErr w:type="spellStart"/>
+      <w:r>
+        <w:t>router</w:t>
+      </w:r>
+      <w:proofErr w:type="spellEnd"/>
+      <w:r>
+        <w:t>.</w:t>
+      </w:r>
+    </w:p>
+    <w:p>
+      <w:r>
+        <w:t xml:space="preserve">Luego </w:t>
+      </w:r>
+      <w:r>
+        <w:t>&lt;</w:t>
+      </w:r>
+      <w:proofErr w:type="spellStart"/>
+      <w:r>
+        <w:t>RouterProvider</w:t>
+      </w:r>
+      <w:proofErr w:type="spellEnd"/>
+      <w:r>
+        <w:t xml:space="preserve"> </w:t>
+      </w:r>
+      <w:proofErr w:type="spellStart"/>
+      <w:r>
+        <w:t>router</w:t>
+      </w:r>
+      <w:proofErr w:type="spellEnd"/>
+      <w:r>
+        <w:t>={</w:t>
+      </w:r>
+      <w:proofErr w:type="spellStart"/>
+      <w:r>
+        <w:t>router</w:t>
+      </w:r>
+      <w:proofErr w:type="spellEnd"/>
+      <w:r>
+        <w:t>}&gt;&lt;/</w:t>
+      </w:r>
+      <w:proofErr w:type="spellStart"/>
+      <w:r>
+        <w:t>RouterProvider</w:t>
+      </w:r>
+      <w:proofErr w:type="spellEnd"/>
+      <w:r>
+        <w:t xml:space="preserve">&gt; {/**entrega el </w:t>
+      </w:r>
+      <w:proofErr w:type="spellStart"/>
+      <w:r>
+        <w:t>router</w:t>
+      </w:r>
+      <w:proofErr w:type="spellEnd"/>
+      <w:r>
+        <w:t xml:space="preserve"> a la </w:t>
+      </w:r>
+      <w:proofErr w:type="spellStart"/>
+      <w:r>
+        <w:t>aplicacion</w:t>
+      </w:r>
+      <w:proofErr w:type="spellEnd"/>
+      <w:r>
+        <w:t>*/}</w:t>
+      </w:r>
+    </w:p>
+    <w:p>
+      <w:pPr>
+        <w:rPr>
+          <w:b/>
+          <w:bCs/>
+        </w:rPr>
+      </w:pPr>
+      <w:r>
+        <w:t xml:space="preserve"> Y es lo único que tenemos dentro de </w:t>
+      </w:r>
+      <w:proofErr w:type="spellStart"/>
+      <w:r>
+        <w:t>app.jsx</w:t>
+      </w:r>
+      <w:proofErr w:type="spellEnd"/>
+      <w:r>
+        <w:t xml:space="preserve">, </w:t>
+      </w:r>
+      <w:r>
+        <w:rPr>
+          <w:b/>
+          <w:bCs/>
+        </w:rPr>
+        <w:t>NO SE TOCA MAS</w:t>
+      </w:r>
+    </w:p>
+    <w:p>
+      <w:pPr>
+        <w:rPr>
+          <w:b/>
+          <w:bCs/>
+        </w:rPr>
+      </w:pPr>
+      <w:r>
+        <w:rPr>
+          <w:b/>
+          <w:bCs/>
+        </w:rPr>
+        <w:t xml:space="preserve">2) En </w:t>
+      </w:r>
+      <w:proofErr w:type="spellStart"/>
+      <w:r>
+        <w:rPr>
+          <w:b/>
+          <w:bCs/>
+        </w:rPr>
+        <w:t>router.jsx</w:t>
+      </w:r>
+      <w:proofErr w:type="spellEnd"/>
+      <w:r>
+        <w:rPr>
+          <w:b/>
+          <w:bCs/>
+        </w:rPr>
+        <w:t xml:space="preserve"> </w:t>
+      </w:r>
+    </w:p>
+    <w:p>
+      <w:r>
+        <w:t xml:space="preserve">Importar </w:t>
+      </w:r>
+      <w:proofErr w:type="spellStart"/>
+      <w:r>
+        <w:t>createbrowserrouter</w:t>
+      </w:r>
+      <w:proofErr w:type="spellEnd"/>
+      <w:r>
+        <w:t xml:space="preserve">, </w:t>
+      </w:r>
+      <w:proofErr w:type="spellStart"/>
+      <w:r>
+        <w:t>layoutpublico</w:t>
+      </w:r>
+      <w:proofErr w:type="spellEnd"/>
+      <w:r>
+        <w:t xml:space="preserve"> y </w:t>
+      </w:r>
+      <w:proofErr w:type="gramStart"/>
+      <w:r>
+        <w:t>home(</w:t>
+      </w:r>
+      <w:proofErr w:type="gramEnd"/>
+      <w:r>
+        <w:t xml:space="preserve">Por ahora, ya que solo tengo esto, luego </w:t>
+      </w:r>
+      <w:proofErr w:type="spellStart"/>
+      <w:r>
+        <w:t>aca</w:t>
+      </w:r>
+      <w:proofErr w:type="spellEnd"/>
+      <w:r>
+        <w:t xml:space="preserve"> tengo que importar todos los otros componentes, por </w:t>
+      </w:r>
+      <w:proofErr w:type="spellStart"/>
+      <w:r>
+        <w:t>ej</w:t>
+      </w:r>
+      <w:proofErr w:type="spellEnd"/>
+      <w:r>
+        <w:t xml:space="preserve">: catalogo, plan de </w:t>
+      </w:r>
+      <w:proofErr w:type="spellStart"/>
+      <w:r>
+        <w:t>ahorro,etc</w:t>
+      </w:r>
+      <w:proofErr w:type="spellEnd"/>
+      <w:r>
+        <w:t>)</w:t>
+      </w:r>
+      <w:r>
+        <w:t xml:space="preserve"> </w:t>
+      </w:r>
+      <w:proofErr w:type="spellStart"/>
+      <w:r>
+        <w:t>Tambien</w:t>
+      </w:r>
+      <w:proofErr w:type="spellEnd"/>
+      <w:r>
+        <w:t xml:space="preserve"> </w:t>
+      </w:r>
+      <w:proofErr w:type="spellStart"/>
+      <w:r>
+        <w:t>aca</w:t>
+      </w:r>
+      <w:proofErr w:type="spellEnd"/>
+      <w:r>
+        <w:t xml:space="preserve"> deberíamos importar el </w:t>
+      </w:r>
+      <w:proofErr w:type="spellStart"/>
+      <w:r>
+        <w:t>layoutprivado</w:t>
+      </w:r>
+      <w:proofErr w:type="spellEnd"/>
+      <w:r>
+        <w:t xml:space="preserve">, el de </w:t>
+      </w:r>
+      <w:proofErr w:type="spellStart"/>
+      <w:r>
+        <w:t>gestor,etc</w:t>
+      </w:r>
+      <w:proofErr w:type="spellEnd"/>
+    </w:p>
+    <w:p/>
+    <w:p/>
+    <w:p/>
+    <w:p/>
+    <w:p/>
     <w:sectPr>
       <w:pgSz w:w="11906" w:h="16838"/>
       <w:pgMar w:top="1417" w:right="1701" w:bottom="1417" w:left="1701" w:header="708" w:footer="708" w:gutter="0"/>

</xml_diff>

<commit_message>
se configuro NavBar y barra busuqeda correctamente
</commit_message>
<xml_diff>
--- a/Conceptos.docx
+++ b/Conceptos.docx
@@ -4,7 +4,148 @@
   <w:body>
     <w:p>
       <w:pPr>
+        <w:rPr>
+          <w:b/>
+          <w:bCs/>
+        </w:rPr>
+      </w:pPr>
+      <w:r>
+        <w:rPr>
+          <w:b/>
+          <w:bCs/>
+        </w:rPr>
+        <w:t xml:space="preserve">Link y </w:t>
+      </w:r>
+      <w:proofErr w:type="spellStart"/>
+      <w:r>
+        <w:rPr>
+          <w:b/>
+          <w:bCs/>
+        </w:rPr>
+        <w:t>Navlink</w:t>
+      </w:r>
+      <w:proofErr w:type="spellEnd"/>
+      <w:r>
+        <w:rPr>
+          <w:b/>
+          <w:bCs/>
+        </w:rPr>
+        <w:t>:</w:t>
+      </w:r>
+    </w:p>
+    <w:p>
+      <w:r>
+        <w:t>Link: enlace normal</w:t>
+      </w:r>
+    </w:p>
+    <w:p>
+      <w:proofErr w:type="spellStart"/>
+      <w:r>
+        <w:t>Usalo</w:t>
+      </w:r>
+      <w:proofErr w:type="spellEnd"/>
+      <w:r>
+        <w:t xml:space="preserve"> cuando simplemente </w:t>
+      </w:r>
+      <w:proofErr w:type="spellStart"/>
+      <w:r>
+        <w:t>querés</w:t>
+      </w:r>
+      <w:proofErr w:type="spellEnd"/>
+      <w:r>
+        <w:t xml:space="preserve"> ir a otra página/ruta.</w:t>
+      </w:r>
+      <w:r>
+        <w:t xml:space="preserve"> Ya que este no detecta la ruta actual</w:t>
+      </w:r>
+    </w:p>
+    <w:p>
+      <w:pPr>
+        <w:rPr>
+          <w:b/>
+          <w:bCs/>
+        </w:rPr>
+      </w:pPr>
+      <w:proofErr w:type="spellStart"/>
+      <w:r>
+        <w:rPr>
+          <w:b/>
+          <w:bCs/>
+        </w:rPr>
+        <w:t>NavLink</w:t>
+      </w:r>
+      <w:proofErr w:type="spellEnd"/>
+      <w:r>
+        <w:rPr>
+          <w:b/>
+          <w:bCs/>
+        </w:rPr>
+        <w:t>: enlace de navegación</w:t>
+      </w:r>
+    </w:p>
+    <w:p>
+      <w:proofErr w:type="spellStart"/>
+      <w:r>
+        <w:t>Usalo</w:t>
+      </w:r>
+      <w:proofErr w:type="spellEnd"/>
+      <w:r>
+        <w:t xml:space="preserve"> principalmente cuando el enlace forma parte de un </w:t>
+      </w:r>
+      <w:r>
+        <w:rPr>
+          <w:b/>
+          <w:bCs/>
+        </w:rPr>
+        <w:t>menú de navegación</w:t>
+      </w:r>
+      <w:r>
+        <w:t xml:space="preserve"> y </w:t>
+      </w:r>
+      <w:proofErr w:type="spellStart"/>
+      <w:r>
+        <w:t>querés</w:t>
+      </w:r>
+      <w:proofErr w:type="spellEnd"/>
+      <w:r>
+        <w:t xml:space="preserve"> saber cuándo esa opción está activa.</w:t>
+      </w:r>
+      <w:r>
+        <w:t xml:space="preserve"> </w:t>
+      </w:r>
+      <w:r>
+        <w:t xml:space="preserve">La ventaja es que </w:t>
+      </w:r>
+      <w:proofErr w:type="spellStart"/>
+      <w:r>
+        <w:t>NavLink</w:t>
+      </w:r>
+      <w:proofErr w:type="spellEnd"/>
+      <w:r>
+        <w:t xml:space="preserve"> sabe si la ruta coincide con la página actual.</w:t>
+      </w:r>
+    </w:p>
+    <w:p/>
+    <w:p>
+      <w:pPr>
+        <w:rPr>
+          <w:b/>
+          <w:bCs/>
+        </w:rPr>
+      </w:pPr>
+    </w:p>
+    <w:p>
+      <w:pPr>
         <w:jc w:val="center"/>
+        <w:rPr>
+          <w:b/>
+          <w:bCs/>
+        </w:rPr>
+      </w:pPr>
+    </w:p>
+    <w:p>
+      <w:pPr>
+        <w:jc w:val="center"/>
       </w:pPr>
       <w:r>
         <w:rPr>
@@ -16,15 +157,7 @@
     </w:p>
     <w:p>
       <w:r>
-        <w:t>* **Visitante Público (Sin sesión</w:t>
-      </w:r>
-      <w:proofErr w:type="gramStart"/>
-      <w:r>
-        <w:t>):*</w:t>
-      </w:r>
-      <w:proofErr w:type="gramEnd"/>
-      <w:r>
-        <w:t>* Puede explorar la vidriera/catálogo, ver detalles de motos y consultar información general.</w:t>
+        <w:t>* **Visitante Público (Sin sesión):** Puede explorar la vidriera/catálogo, ver detalles de motos y consultar información general.</w:t>
       </w:r>
     </w:p>
     <w:p>
@@ -32,43 +165,22 @@
         <w:t xml:space="preserve">* **Cliente </w:t>
       </w:r>
       <w:proofErr w:type="spellStart"/>
-      <w:proofErr w:type="gramStart"/>
       <w:r>
         <w:t>Logueado</w:t>
       </w:r>
       <w:proofErr w:type="spellEnd"/>
       <w:r>
-        <w:t>:*</w:t>
-      </w:r>
-      <w:proofErr w:type="gramEnd"/>
-      <w:r>
-        <w:t>* Puede solicitar la reserva de una moto por 48hs y ver sus reservas activas.</w:t>
-      </w:r>
-    </w:p>
-    <w:p>
-      <w:r>
-        <w:t>* **Vendedor (Empleado</w:t>
-      </w:r>
-      <w:proofErr w:type="gramStart"/>
-      <w:r>
-        <w:t>):*</w:t>
-      </w:r>
-      <w:proofErr w:type="gramEnd"/>
-      <w:r>
-        <w:t>* Puede confirmar/rechazar reservas de clientes, registrar ventas directas en mostrador y consultar su historial de ventas y comisiones asociadas.</w:t>
-      </w:r>
-    </w:p>
-    <w:p>
-      <w:r>
-        <w:t>* **Administrador (Dueño</w:t>
-      </w:r>
-      <w:proofErr w:type="gramStart"/>
-      <w:r>
-        <w:t>):*</w:t>
-      </w:r>
-      <w:proofErr w:type="gramEnd"/>
-      <w:r>
-        <w:t>* Posee acceso total al sistema: gestión de usuarios/vendedores, control global de stock y acceso al **</w:t>
+        <w:t>:** Puede solicitar la reserva de una moto por 48hs y ver sus reservas activas.</w:t>
+      </w:r>
+    </w:p>
+    <w:p>
+      <w:r>
+        <w:t>* **Vendedor (Empleado):** Puede confirmar/rechazar reservas de clientes, registrar ventas directas en mostrador y consultar su historial de ventas y comisiones asociadas.</w:t>
+      </w:r>
+    </w:p>
+    <w:p>
+      <w:r>
+        <w:t>* **Administrador (Dueño):** Posee acceso total al sistema: gestión de usuarios/vendedores, control global de stock y acceso al **</w:t>
       </w:r>
       <w:proofErr w:type="spellStart"/>
       <w:r>
@@ -221,6 +333,7 @@
         <w:ind w:left="708"/>
       </w:pPr>
       <w:r>
+        <w:lastRenderedPageBreak/>
         <w:t>Dentro de la zona privada, la navegación (</w:t>
       </w:r>
       <w:proofErr w:type="spellStart"/>
@@ -309,15 +422,7 @@
         <w:t>Administrador</w:t>
       </w:r>
       <w:r>
-        <w:t xml:space="preserve">, el menú le </w:t>
-      </w:r>
-      <w:proofErr w:type="gramStart"/>
-      <w:r>
-        <w:t>habilita</w:t>
-      </w:r>
-      <w:proofErr w:type="gramEnd"/>
-      <w:r>
-        <w:t xml:space="preserve"> además: </w:t>
+        <w:t xml:space="preserve">, el menú le habilita además: </w:t>
       </w:r>
       <w:proofErr w:type="spellStart"/>
       <w:r>
@@ -459,7 +564,6 @@
           <w:b/>
           <w:bCs/>
         </w:rPr>
-        <w:lastRenderedPageBreak/>
         <w:t>Impacto en el trabajo de a 3:</w:t>
       </w:r>
       <w:r>
@@ -508,7 +612,15 @@
       </w:r>
       <w:proofErr w:type="spellEnd"/>
       <w:r>
-        <w:t xml:space="preserve">/panel y Integrante 3 en </w:t>
+        <w:t xml:space="preserve">/panel </w:t>
+      </w:r>
+      <w:proofErr w:type="spellStart"/>
+      <w:r>
+        <w:t>y</w:t>
+      </w:r>
+      <w:proofErr w:type="spellEnd"/>
+      <w:r>
+        <w:t xml:space="preserve"> Integrante 3 en </w:t>
       </w:r>
       <w:proofErr w:type="spellStart"/>
       <w:r>
@@ -605,7 +717,6 @@
           <w:bCs/>
         </w:rPr>
       </w:pPr>
-      <w:proofErr w:type="gramStart"/>
       <w:r>
         <w:rPr>
           <w:b/>
@@ -613,7 +724,6 @@
         </w:rPr>
         <w:t>Como se estructura el código?</w:t>
       </w:r>
-      <w:proofErr w:type="gramEnd"/>
     </w:p>
     <w:p>
       <w:pPr>
@@ -633,7 +743,6 @@
         <w:t xml:space="preserve"> </w:t>
       </w:r>
       <w:proofErr w:type="spellStart"/>
-      <w:proofErr w:type="gramStart"/>
       <w:r>
         <w:rPr>
           <w:b/>
@@ -652,7 +761,6 @@
         </w:rPr>
         <w:t>)</w:t>
       </w:r>
-      <w:proofErr w:type="gramEnd"/>
       <w:r>
         <w:t xml:space="preserve">. </w:t>
       </w:r>
@@ -669,7 +777,6 @@
           <w:bCs/>
         </w:rPr>
       </w:pPr>
-      <w:proofErr w:type="gramStart"/>
       <w:r>
         <w:rPr>
           <w:b/>
@@ -677,13 +784,13 @@
         </w:rPr>
         <w:t>Que va en cada una de las carpetas?</w:t>
       </w:r>
-      <w:proofErr w:type="gramEnd"/>
-    </w:p>
-    <w:p>
-      <w:pPr>
-        <w:ind w:left="708"/>
-      </w:pPr>
-      <w:r>
+    </w:p>
+    <w:p>
+      <w:pPr>
+        <w:ind w:left="708"/>
+      </w:pPr>
+      <w:r>
+        <w:lastRenderedPageBreak/>
         <w:t xml:space="preserve">Según el esquema de organización por funcionalidad (Nivel 3), la distribución de responsabilidades para esas carpetas dentro de </w:t>
       </w:r>
       <w:proofErr w:type="spellStart"/>
@@ -745,109 +852,87 @@
         <w:ind w:left="708"/>
       </w:pPr>
       <w:r>
+        <w:t xml:space="preserve">Por ejemplo las imágenes de carrusel van </w:t>
+      </w:r>
+      <w:proofErr w:type="spellStart"/>
+      <w:r>
+        <w:t>aca</w:t>
+      </w:r>
+      <w:proofErr w:type="spellEnd"/>
+      <w:r>
+        <w:t xml:space="preserve"> adentro</w:t>
+      </w:r>
+      <w:r>
+        <w:t>.</w:t>
+      </w:r>
+    </w:p>
+    <w:p>
+      <w:pPr>
+        <w:ind w:left="708"/>
+      </w:pPr>
+      <w:r>
+        <w:t xml:space="preserve">  Si el carrusel es parte de la maquetación fija (por ejemplo, banners promocionales fijos o una sección </w:t>
+      </w:r>
+      <w:proofErr w:type="spellStart"/>
+      <w:r>
+        <w:t>hero</w:t>
+      </w:r>
+      <w:proofErr w:type="spellEnd"/>
+      <w:r>
+        <w:t xml:space="preserve"> en la portada), estas imágenes forman parte del código visual de la app. </w:t>
+      </w:r>
+    </w:p>
+    <w:p>
+      <w:pPr>
+        <w:ind w:left="708"/>
+      </w:pPr>
+      <w:r>
+        <w:t xml:space="preserve">  </w:t>
+      </w:r>
+      <w:r>
+        <w:rPr>
+          <w:b/>
+          <w:bCs/>
+        </w:rPr>
+        <w:t>Por qué:</w:t>
+      </w:r>
+      <w:r>
+        <w:t xml:space="preserve"> Al importarlas dentro de tu componente (ejemplo: </w:t>
+      </w:r>
+      <w:proofErr w:type="spellStart"/>
+      <w:r>
+        <w:t>import</w:t>
+      </w:r>
+      <w:proofErr w:type="spellEnd"/>
+      <w:r>
+        <w:t xml:space="preserve"> banner1 </w:t>
+      </w:r>
+      <w:proofErr w:type="spellStart"/>
+      <w:r>
+        <w:t>from</w:t>
+      </w:r>
+      <w:proofErr w:type="spellEnd"/>
+      <w:r>
+        <w:t xml:space="preserve"> '../</w:t>
+      </w:r>
+      <w:proofErr w:type="spellStart"/>
+      <w:r>
+        <w:t>assets</w:t>
+      </w:r>
+      <w:proofErr w:type="spellEnd"/>
+      <w:r>
+        <w:t>/banner1.jpg'), Vite las procesa, optimiza su peso y les agrega un identificador único (hash) para una gestión eficiente de la caché.</w:t>
+      </w:r>
+    </w:p>
+    <w:p>
+      <w:pPr>
+        <w:ind w:left="708"/>
+      </w:pPr>
+      <w:r>
+        <w:rPr>
+          <w:noProof/>
+        </w:rPr>
         <w:lastRenderedPageBreak/>
-        <w:t xml:space="preserve">Por </w:t>
-      </w:r>
-      <w:proofErr w:type="gramStart"/>
-      <w:r>
-        <w:t>ejemplo</w:t>
-      </w:r>
-      <w:proofErr w:type="gramEnd"/>
-      <w:r>
-        <w:t xml:space="preserve"> las imágenes de carrusel van </w:t>
-      </w:r>
-      <w:proofErr w:type="spellStart"/>
-      <w:r>
-        <w:t>aca</w:t>
-      </w:r>
-      <w:proofErr w:type="spellEnd"/>
-      <w:r>
-        <w:t xml:space="preserve"> adentro</w:t>
-      </w:r>
-      <w:r>
-        <w:t>.</w:t>
-      </w:r>
-    </w:p>
-    <w:p>
-      <w:pPr>
-        <w:ind w:left="708"/>
-      </w:pPr>
-      <w:proofErr w:type="gramStart"/>
-      <w:r>
-        <w:t>  Si</w:t>
-      </w:r>
-      <w:proofErr w:type="gramEnd"/>
-      <w:r>
-        <w:t xml:space="preserve"> el carrusel es parte de la maquetación fija (por ejemplo, banners promocionales fijos o una sección </w:t>
-      </w:r>
-      <w:proofErr w:type="spellStart"/>
-      <w:r>
-        <w:t>hero</w:t>
-      </w:r>
-      <w:proofErr w:type="spellEnd"/>
-      <w:r>
-        <w:t xml:space="preserve"> en la portada), estas imágenes forman parte del código visual de la app. </w:t>
-      </w:r>
-    </w:p>
-    <w:p>
-      <w:pPr>
-        <w:ind w:left="708"/>
-      </w:pPr>
-      <w:proofErr w:type="gramStart"/>
-      <w:r>
-        <w:t xml:space="preserve">  </w:t>
-      </w:r>
-      <w:r>
-        <w:rPr>
-          <w:b/>
-          <w:bCs/>
-        </w:rPr>
-        <w:t>Por</w:t>
-      </w:r>
-      <w:proofErr w:type="gramEnd"/>
-      <w:r>
-        <w:rPr>
-          <w:b/>
-          <w:bCs/>
-        </w:rPr>
-        <w:t xml:space="preserve"> qué:</w:t>
-      </w:r>
-      <w:r>
-        <w:t xml:space="preserve"> Al importarlas dentro de tu componente (ejemplo: </w:t>
-      </w:r>
-      <w:proofErr w:type="spellStart"/>
-      <w:r>
-        <w:t>import</w:t>
-      </w:r>
-      <w:proofErr w:type="spellEnd"/>
-      <w:r>
-        <w:t xml:space="preserve"> banner1 </w:t>
-      </w:r>
-      <w:proofErr w:type="spellStart"/>
-      <w:r>
-        <w:t>from</w:t>
-      </w:r>
-      <w:proofErr w:type="spellEnd"/>
-      <w:r>
-        <w:t xml:space="preserve"> '../</w:t>
-      </w:r>
-      <w:proofErr w:type="spellStart"/>
-      <w:r>
-        <w:t>assets</w:t>
-      </w:r>
-      <w:proofErr w:type="spellEnd"/>
-      <w:r>
-        <w:t>/banner1.jpg'), Vite las procesa, optimiza su peso y les agrega un identificador único (hash) para una gestión eficiente de la caché.</w:t>
-      </w:r>
-    </w:p>
-    <w:p>
-      <w:pPr>
-        <w:ind w:left="708"/>
-      </w:pPr>
-      <w:r>
-        <w:rPr>
-          <w:noProof/>
-        </w:rPr>
         <w:drawing>
           <wp:inline distT="0" distB="0" distL="0" distR="0" wp14:anchorId="58911186" wp14:editId="26C5AB9D">
             <wp:extent cx="5400040" cy="3053715"/>
@@ -933,7 +1018,6 @@
         <w:rPr>
           <w:noProof/>
         </w:rPr>
-        <w:lastRenderedPageBreak/>
         <w:drawing>
           <wp:inline distT="0" distB="0" distL="0" distR="0" wp14:anchorId="739AACD3" wp14:editId="543C2D67">
             <wp:extent cx="4206240" cy="2628900"/>
@@ -1076,6 +1160,7 @@
           <w:b/>
           <w:bCs/>
         </w:rPr>
+        <w:lastRenderedPageBreak/>
         <w:t>Por qué:</w:t>
       </w:r>
       <w:r>
@@ -1139,7 +1224,6 @@
           <w:bCs/>
         </w:rPr>
       </w:pPr>
-      <w:proofErr w:type="gramStart"/>
       <w:r>
         <w:rPr>
           <w:b/>
@@ -1147,7 +1231,6 @@
         </w:rPr>
         <w:t>Donde van los JSON?</w:t>
       </w:r>
-      <w:proofErr w:type="gramEnd"/>
     </w:p>
     <w:p>
       <w:pPr>
@@ -1178,11 +1261,7 @@
       </w:r>
       <w:proofErr w:type="spellEnd"/>
       <w:r>
-        <w:t xml:space="preserve"> llamada </w:t>
-      </w:r>
-      <w:proofErr w:type="gramStart"/>
-      <w:r>
-        <w:t>data/</w:t>
+        <w:t xml:space="preserve"> llamada data/</w:t>
       </w:r>
       <w:proofErr w:type="spellStart"/>
       <w:r>
@@ -1195,7 +1274,6 @@
       <w:r>
         <w:t>,</w:t>
       </w:r>
-      <w:proofErr w:type="gramEnd"/>
       <w:r>
         <w:t xml:space="preserve"> </w:t>
       </w:r>
@@ -1226,7 +1304,6 @@
       <w:pPr>
         <w:ind w:left="708"/>
       </w:pPr>
-      <w:proofErr w:type="gramStart"/>
       <w:r>
         <w:t xml:space="preserve">  </w:t>
       </w:r>
@@ -1235,15 +1312,7 @@
           <w:b/>
           <w:bCs/>
         </w:rPr>
-        <w:t>Consumo</w:t>
-      </w:r>
-      <w:proofErr w:type="gramEnd"/>
-      <w:r>
-        <w:rPr>
-          <w:b/>
-          <w:bCs/>
-        </w:rPr>
-        <w:t xml:space="preserve"> a través de servicios:</w:t>
+        <w:t>Consumo a través de servicios:</w:t>
       </w:r>
       <w:r>
         <w:t xml:space="preserve"> En </w:t>
@@ -1288,7 +1357,6 @@
       <w:pPr>
         <w:ind w:left="708"/>
       </w:pPr>
-      <w:proofErr w:type="gramStart"/>
       <w:r>
         <w:t xml:space="preserve">  </w:t>
       </w:r>
@@ -1297,15 +1365,7 @@
           <w:b/>
           <w:bCs/>
         </w:rPr>
-        <w:t>Transición</w:t>
-      </w:r>
-      <w:proofErr w:type="gramEnd"/>
-      <w:r>
-        <w:rPr>
-          <w:b/>
-          <w:bCs/>
-        </w:rPr>
-        <w:t xml:space="preserve"> a producción sin tocar la interfaz:</w:t>
+        <w:t>Transición a producción sin tocar la interfaz:</w:t>
       </w:r>
       <w:r>
         <w:t xml:space="preserve"> Mientras el </w:t>
@@ -1324,39 +1384,36 @@
       </w:r>
       <w:proofErr w:type="spellEnd"/>
       <w:r>
-        <w:t xml:space="preserve"> a ese JSON simulado o devuelven esos datos de prueba. Cuando se implemente la API real en Node.js/Express, se </w:t>
-      </w:r>
-      <w:r>
+        <w:t xml:space="preserve"> a ese JSON simulado o devuelven esos datos de prueba. Cuando se implemente la API real en Node.js/Express, se reemplaza la llamada dentro de </w:t>
+      </w:r>
+      <w:proofErr w:type="spellStart"/>
+      <w:r>
+        <w:t>services</w:t>
+      </w:r>
+      <w:proofErr w:type="spellEnd"/>
+      <w:r>
+        <w:t xml:space="preserve">/ sin tener que alterar ningún componente ni vista de </w:t>
+      </w:r>
+      <w:proofErr w:type="spellStart"/>
+      <w:r>
+        <w:t>React</w:t>
+      </w:r>
+      <w:proofErr w:type="spellEnd"/>
+      <w:r>
+        <w:t xml:space="preserve">. </w:t>
+      </w:r>
+    </w:p>
+    <w:p>
+      <w:pPr>
+        <w:ind w:left="708"/>
+      </w:pPr>
+    </w:p>
+    <w:p>
+      <w:r>
+        <w:rPr>
+          <w:noProof/>
+        </w:rPr>
         <w:lastRenderedPageBreak/>
-        <w:t xml:space="preserve">reemplaza la llamada dentro de </w:t>
-      </w:r>
-      <w:proofErr w:type="spellStart"/>
-      <w:r>
-        <w:t>services</w:t>
-      </w:r>
-      <w:proofErr w:type="spellEnd"/>
-      <w:r>
-        <w:t xml:space="preserve">/ sin tener que alterar ningún componente ni vista de </w:t>
-      </w:r>
-      <w:proofErr w:type="spellStart"/>
-      <w:r>
-        <w:t>React</w:t>
-      </w:r>
-      <w:proofErr w:type="spellEnd"/>
-      <w:r>
-        <w:t xml:space="preserve">. </w:t>
-      </w:r>
-    </w:p>
-    <w:p>
-      <w:pPr>
-        <w:ind w:left="708"/>
-      </w:pPr>
-    </w:p>
-    <w:p>
-      <w:r>
-        <w:rPr>
-          <w:noProof/>
-        </w:rPr>
         <w:drawing>
           <wp:inline distT="0" distB="0" distL="0" distR="0" wp14:anchorId="3CF8B521" wp14:editId="7518B8DD">
             <wp:extent cx="5400040" cy="2397760"/>
@@ -1497,37 +1554,72 @@
     </w:p>
     <w:p>
       <w:r>
+        <w:t xml:space="preserve">Uso [ ] para definir un arreglo y { } para definir un objeto, en la sintaxis </w:t>
+      </w:r>
+      <w:proofErr w:type="spellStart"/>
+      <w:r>
+        <w:t>json</w:t>
+      </w:r>
+      <w:proofErr w:type="spellEnd"/>
+      <w:r>
+        <w:t xml:space="preserve"> los datos son pares de clave: valor. </w:t>
+      </w:r>
+      <w:proofErr w:type="spellStart"/>
+      <w:r>
+        <w:t>Ademas</w:t>
+      </w:r>
+      <w:proofErr w:type="spellEnd"/>
+      <w:r>
+        <w:t xml:space="preserve"> se debe contar con un id por cada elemento. Por ejemplo:</w:t>
+      </w:r>
+    </w:p>
+    <w:p>
+      <w:r>
+        <w:t>[</w:t>
+      </w:r>
+    </w:p>
+    <w:p>
+      <w:r>
+        <w:t xml:space="preserve">  {</w:t>
+      </w:r>
+    </w:p>
+    <w:p>
+      <w:r>
         <w:lastRenderedPageBreak/>
-        <w:t xml:space="preserve">Uso </w:t>
-      </w:r>
-      <w:proofErr w:type="gramStart"/>
-      <w:r>
-        <w:t>[ ]</w:t>
-      </w:r>
-      <w:proofErr w:type="gramEnd"/>
-      <w:r>
-        <w:t xml:space="preserve"> para definir un arreglo y { } para definir un objeto, en la sintaxis </w:t>
-      </w:r>
-      <w:proofErr w:type="spellStart"/>
-      <w:r>
-        <w:t>json</w:t>
-      </w:r>
-      <w:proofErr w:type="spellEnd"/>
-      <w:r>
-        <w:t xml:space="preserve"> los datos son pares de clave: valor. </w:t>
-      </w:r>
-      <w:proofErr w:type="spellStart"/>
-      <w:r>
-        <w:t>Ademas</w:t>
-      </w:r>
-      <w:proofErr w:type="spellEnd"/>
-      <w:r>
-        <w:t xml:space="preserve"> se debe contar con un id por cada elemento. Por ejemplo:</w:t>
-      </w:r>
-    </w:p>
-    <w:p>
-      <w:r>
-        <w:t>[</w:t>
+        <w:t xml:space="preserve">    "id": 1,</w:t>
+      </w:r>
+    </w:p>
+    <w:p>
+      <w:r>
+        <w:t xml:space="preserve">    "titulo": "Teclado mecánico RGB",</w:t>
+      </w:r>
+    </w:p>
+    <w:p>
+      <w:r>
+        <w:t xml:space="preserve">    "precio": 75.50,</w:t>
+      </w:r>
+    </w:p>
+    <w:p>
+      <w:r>
+        <w:t xml:space="preserve">    "imagen": "/productos/teclado.jpg",</w:t>
+      </w:r>
+    </w:p>
+    <w:p>
+      <w:r>
+        <w:t xml:space="preserve">    "</w:t>
+      </w:r>
+      <w:proofErr w:type="spellStart"/>
+      <w:r>
+        <w:t>enStock</w:t>
+      </w:r>
+      <w:proofErr w:type="spellEnd"/>
+      <w:r>
+        <w:t>": true</w:t>
+      </w:r>
+    </w:p>
+    <w:p>
+      <w:r>
+        <w:t xml:space="preserve">  },</w:t>
       </w:r>
     </w:p>
     <w:p>
@@ -1537,22 +1629,22 @@
     </w:p>
     <w:p>
       <w:r>
-        <w:t xml:space="preserve">    "id": 1,</w:t>
-      </w:r>
-    </w:p>
-    <w:p>
-      <w:r>
-        <w:t xml:space="preserve">    "titulo": "Teclado mecánico RGB",</w:t>
-      </w:r>
-    </w:p>
-    <w:p>
-      <w:r>
-        <w:t xml:space="preserve">    "precio": 75.50,</w:t>
-      </w:r>
-    </w:p>
-    <w:p>
-      <w:r>
-        <w:t xml:space="preserve">    "imagen": "/productos/teclado.jpg",</w:t>
+        <w:t xml:space="preserve">    "id": 2,</w:t>
+      </w:r>
+    </w:p>
+    <w:p>
+      <w:r>
+        <w:t xml:space="preserve">    "titulo": "Mouse inalámbrico",</w:t>
+      </w:r>
+    </w:p>
+    <w:p>
+      <w:r>
+        <w:t xml:space="preserve">    "precio": 30.00,</w:t>
+      </w:r>
+    </w:p>
+    <w:p>
+      <w:r>
+        <w:t xml:space="preserve">    "imagen": "/productos/mouse.jpg",</w:t>
       </w:r>
     </w:p>
     <w:p>
@@ -1565,49 +1657,6 @@
       </w:r>
       <w:proofErr w:type="spellEnd"/>
       <w:r>
-        <w:t>": true</w:t>
-      </w:r>
-    </w:p>
-    <w:p>
-      <w:r>
-        <w:t xml:space="preserve">  },</w:t>
-      </w:r>
-    </w:p>
-    <w:p>
-      <w:r>
-        <w:t xml:space="preserve">  {</w:t>
-      </w:r>
-    </w:p>
-    <w:p>
-      <w:r>
-        <w:t xml:space="preserve">    "id": 2,</w:t>
-      </w:r>
-    </w:p>
-    <w:p>
-      <w:r>
-        <w:t xml:space="preserve">    "titulo": "Mouse inalámbrico",</w:t>
-      </w:r>
-    </w:p>
-    <w:p>
-      <w:r>
-        <w:t xml:space="preserve">    "precio": 30.00,</w:t>
-      </w:r>
-    </w:p>
-    <w:p>
-      <w:r>
-        <w:t xml:space="preserve">    "imagen": "/productos/mouse.jpg",</w:t>
-      </w:r>
-    </w:p>
-    <w:p>
-      <w:r>
-        <w:t xml:space="preserve">    "</w:t>
-      </w:r>
-      <w:proofErr w:type="spellStart"/>
-      <w:r>
-        <w:t>enStock</w:t>
-      </w:r>
-      <w:proofErr w:type="spellEnd"/>
-      <w:r>
         <w:t>": false</w:t>
       </w:r>
     </w:p>
@@ -1639,37 +1688,233 @@
       </w:r>
     </w:p>
     <w:p>
-      <w:proofErr w:type="gramStart"/>
-      <w:r>
-        <w:t>Para que sirve?</w:t>
-      </w:r>
-      <w:proofErr w:type="gramEnd"/>
+      <w:r>
+        <w:t>Para que sirve? se carga una sola vez y, a partir de ahí, JavaScript se encarga de cambiar lo que se ve en pantalla sin</w:t>
+      </w:r>
+    </w:p>
+    <w:p>
+      <w:r>
+        <w:t xml:space="preserve">recargar. A esto se lo llama SPA (Single Page </w:t>
+      </w:r>
+      <w:proofErr w:type="spellStart"/>
+      <w:r>
+        <w:t>Application</w:t>
+      </w:r>
+      <w:proofErr w:type="spellEnd"/>
+      <w:r>
+        <w:t xml:space="preserve"> "aplicación de una sola página").</w:t>
+      </w:r>
+    </w:p>
+    <w:p>
+      <w:r>
+        <w:t xml:space="preserve">Por ejemplo en </w:t>
+      </w:r>
+      <w:proofErr w:type="spellStart"/>
+      <w:r>
+        <w:t>layoutpublico</w:t>
+      </w:r>
+      <w:proofErr w:type="spellEnd"/>
+      <w:r>
+        <w:t>, estábamos usando {</w:t>
+      </w:r>
+      <w:proofErr w:type="spellStart"/>
+      <w:r>
+        <w:t>children</w:t>
+      </w:r>
+      <w:proofErr w:type="spellEnd"/>
+      <w:r>
+        <w:t>} para mostrar contenido, ahora esto cambia, y pasamos a usar(hay que importarlo) el componente {outlet}</w:t>
+      </w:r>
+    </w:p>
+    <w:p>
+      <w:r>
+        <w:t>Y Donde iba {</w:t>
+      </w:r>
+      <w:proofErr w:type="spellStart"/>
+      <w:r>
+        <w:t>children</w:t>
+      </w:r>
+      <w:proofErr w:type="spellEnd"/>
+      <w:r>
+        <w:t xml:space="preserve">}, entre </w:t>
+      </w:r>
+      <w:proofErr w:type="spellStart"/>
+      <w:r>
+        <w:t>nav</w:t>
+      </w:r>
+      <w:proofErr w:type="spellEnd"/>
+      <w:r>
+        <w:t xml:space="preserve"> y </w:t>
+      </w:r>
+      <w:proofErr w:type="spellStart"/>
+      <w:r>
+        <w:t>foot</w:t>
+      </w:r>
+      <w:proofErr w:type="spellEnd"/>
+      <w:r>
+        <w:t>, ahora va &lt;Outlet /&gt;</w:t>
+      </w:r>
+    </w:p>
+    <w:p/>
+    <w:p>
+      <w:r>
+        <w:t>Como se aplica?</w:t>
+      </w:r>
+    </w:p>
+    <w:p>
+      <w:r>
+        <w:t xml:space="preserve">Lo primero es en </w:t>
+      </w:r>
+      <w:proofErr w:type="spellStart"/>
+      <w:r>
+        <w:t>app.jsx</w:t>
+      </w:r>
+      <w:proofErr w:type="spellEnd"/>
+      <w:r>
+        <w:t xml:space="preserve">  importar </w:t>
+      </w:r>
+      <w:proofErr w:type="spellStart"/>
+      <w:r>
+        <w:t>routerprovider</w:t>
+      </w:r>
+      <w:proofErr w:type="spellEnd"/>
+      <w:r>
+        <w:t xml:space="preserve"> y </w:t>
+      </w:r>
+      <w:proofErr w:type="spellStart"/>
+      <w:r>
+        <w:t>router</w:t>
+      </w:r>
+      <w:proofErr w:type="spellEnd"/>
+      <w:r>
+        <w:t>.</w:t>
+      </w:r>
+    </w:p>
+    <w:p>
+      <w:r>
+        <w:t xml:space="preserve">Luego </w:t>
+      </w:r>
+      <w:r>
+        <w:t>&lt;</w:t>
+      </w:r>
+      <w:proofErr w:type="spellStart"/>
+      <w:r>
+        <w:t>RouterProvider</w:t>
+      </w:r>
+      <w:proofErr w:type="spellEnd"/>
       <w:r>
         <w:t xml:space="preserve"> </w:t>
       </w:r>
-      <w:r>
-        <w:t>se carga una sola vez y, a partir de ahí, JavaScript se encarga de cambiar lo que se ve en pantalla sin</w:t>
-      </w:r>
-    </w:p>
-    <w:p>
-      <w:r>
-        <w:t xml:space="preserve">recargar. A esto se lo llama SPA (Single Page </w:t>
-      </w:r>
-      <w:proofErr w:type="spellStart"/>
-      <w:r>
-        <w:t>Application</w:t>
-      </w:r>
-      <w:proofErr w:type="spellEnd"/>
-      <w:r>
+      <w:proofErr w:type="spellStart"/>
+      <w:r>
+        <w:t>router</w:t>
+      </w:r>
+      <w:proofErr w:type="spellEnd"/>
+      <w:r>
+        <w:t>={</w:t>
+      </w:r>
+      <w:proofErr w:type="spellStart"/>
+      <w:r>
+        <w:t>router</w:t>
+      </w:r>
+      <w:proofErr w:type="spellEnd"/>
+      <w:r>
+        <w:t>}&gt;&lt;/</w:t>
+      </w:r>
+      <w:proofErr w:type="spellStart"/>
+      <w:r>
+        <w:t>RouterProvider</w:t>
+      </w:r>
+      <w:proofErr w:type="spellEnd"/>
+      <w:r>
+        <w:t xml:space="preserve">&gt; {/**entrega el </w:t>
+      </w:r>
+      <w:proofErr w:type="spellStart"/>
+      <w:r>
+        <w:t>router</w:t>
+      </w:r>
+      <w:proofErr w:type="spellEnd"/>
+      <w:r>
+        <w:t xml:space="preserve"> a la </w:t>
+      </w:r>
+      <w:proofErr w:type="spellStart"/>
+      <w:r>
+        <w:t>aplicacion</w:t>
+      </w:r>
+      <w:proofErr w:type="spellEnd"/>
+      <w:r>
+        <w:t>*/}</w:t>
+      </w:r>
+    </w:p>
+    <w:p>
+      <w:pPr>
+        <w:rPr>
+          <w:b/>
+          <w:bCs/>
+        </w:rPr>
+      </w:pPr>
+      <w:r>
+        <w:t xml:space="preserve"> Y es lo único que tenemos dentro de </w:t>
+      </w:r>
+      <w:proofErr w:type="spellStart"/>
+      <w:r>
+        <w:t>app.jsx</w:t>
+      </w:r>
+      <w:proofErr w:type="spellEnd"/>
+      <w:r>
+        <w:t xml:space="preserve">, </w:t>
+      </w:r>
+      <w:r>
+        <w:rPr>
+          <w:b/>
+          <w:bCs/>
+        </w:rPr>
+        <w:t>NO SE TOCA MAS</w:t>
+      </w:r>
+    </w:p>
+    <w:p>
+      <w:pPr>
+        <w:rPr>
+          <w:b/>
+          <w:bCs/>
+        </w:rPr>
+      </w:pPr>
+      <w:r>
+        <w:rPr>
+          <w:b/>
+          <w:bCs/>
+        </w:rPr>
+        <w:lastRenderedPageBreak/>
+        <w:t xml:space="preserve">2) En </w:t>
+      </w:r>
+      <w:proofErr w:type="spellStart"/>
+      <w:r>
+        <w:rPr>
+          <w:b/>
+          <w:bCs/>
+        </w:rPr>
+        <w:t>router.jsx</w:t>
+      </w:r>
+      <w:proofErr w:type="spellEnd"/>
+      <w:r>
+        <w:rPr>
+          <w:b/>
+          <w:bCs/>
+        </w:rPr>
         <w:t xml:space="preserve"> </w:t>
       </w:r>
-      <w:r>
-        <w:t>"aplicación de una sola página").</w:t>
-      </w:r>
-    </w:p>
-    <w:p>
-      <w:r>
-        <w:t xml:space="preserve">Por ejemplo en </w:t>
+    </w:p>
+    <w:p>
+      <w:r>
+        <w:t xml:space="preserve">Importar </w:t>
+      </w:r>
+      <w:proofErr w:type="spellStart"/>
+      <w:r>
+        <w:t>createbrowserrouter</w:t>
+      </w:r>
+      <w:proofErr w:type="spellEnd"/>
+      <w:r>
+        <w:t xml:space="preserve">, </w:t>
       </w:r>
       <w:proofErr w:type="spellStart"/>
       <w:r>
@@ -1677,296 +1922,570 @@
       </w:r>
       <w:proofErr w:type="spellEnd"/>
       <w:r>
-        <w:t>, estábamos usando {</w:t>
-      </w:r>
-      <w:proofErr w:type="spellStart"/>
-      <w:r>
-        <w:t>children</w:t>
-      </w:r>
-      <w:proofErr w:type="spellEnd"/>
-      <w:r>
-        <w:t xml:space="preserve">} para mostrar contenido, ahora esto cambia, y pasamos a </w:t>
-      </w:r>
-      <w:proofErr w:type="gramStart"/>
-      <w:r>
-        <w:t>usar(</w:t>
-      </w:r>
-      <w:proofErr w:type="gramEnd"/>
-      <w:r>
-        <w:t>hay que importarlo) el componente {outlet}</w:t>
-      </w:r>
-    </w:p>
-    <w:p>
-      <w:r>
-        <w:t>Y Donde iba {</w:t>
-      </w:r>
-      <w:proofErr w:type="spellStart"/>
-      <w:r>
-        <w:t>children</w:t>
-      </w:r>
-      <w:proofErr w:type="spellEnd"/>
-      <w:r>
-        <w:t xml:space="preserve">}, entre </w:t>
-      </w:r>
-      <w:proofErr w:type="spellStart"/>
-      <w:r>
-        <w:t>nav</w:t>
-      </w:r>
-      <w:proofErr w:type="spellEnd"/>
-      <w:r>
-        <w:t xml:space="preserve"> y </w:t>
-      </w:r>
-      <w:proofErr w:type="spellStart"/>
-      <w:r>
-        <w:t>foot</w:t>
-      </w:r>
-      <w:proofErr w:type="spellEnd"/>
-      <w:r>
-        <w:t>, ahora va &lt;Outlet /&gt;</w:t>
-      </w:r>
+        <w:t xml:space="preserve"> y home(Por ahora, ya que solo tengo esto, luego </w:t>
+      </w:r>
+      <w:proofErr w:type="spellStart"/>
+      <w:r>
+        <w:t>aca</w:t>
+      </w:r>
+      <w:proofErr w:type="spellEnd"/>
+      <w:r>
+        <w:t xml:space="preserve"> tengo que importar todos los otros componentes, por </w:t>
+      </w:r>
+      <w:proofErr w:type="spellStart"/>
+      <w:r>
+        <w:t>ej</w:t>
+      </w:r>
+      <w:proofErr w:type="spellEnd"/>
+      <w:r>
+        <w:t xml:space="preserve">: catalogo, plan de </w:t>
+      </w:r>
+      <w:proofErr w:type="spellStart"/>
+      <w:r>
+        <w:t>ahorro,etc</w:t>
+      </w:r>
+      <w:proofErr w:type="spellEnd"/>
+      <w:r>
+        <w:t>)</w:t>
+      </w:r>
+      <w:r>
+        <w:t xml:space="preserve"> </w:t>
+      </w:r>
+      <w:proofErr w:type="spellStart"/>
+      <w:r>
+        <w:t>Tambien</w:t>
+      </w:r>
+      <w:proofErr w:type="spellEnd"/>
+      <w:r>
+        <w:t xml:space="preserve"> </w:t>
+      </w:r>
+      <w:proofErr w:type="spellStart"/>
+      <w:r>
+        <w:t>aca</w:t>
+      </w:r>
+      <w:proofErr w:type="spellEnd"/>
+      <w:r>
+        <w:t xml:space="preserve"> deberíamos importar el </w:t>
+      </w:r>
+      <w:proofErr w:type="spellStart"/>
+      <w:r>
+        <w:t>layoutprivado</w:t>
+      </w:r>
+      <w:proofErr w:type="spellEnd"/>
+      <w:r>
+        <w:t xml:space="preserve">, el de </w:t>
+      </w:r>
+      <w:proofErr w:type="spellStart"/>
+      <w:r>
+        <w:t>gestor,etc</w:t>
+      </w:r>
+      <w:proofErr w:type="spellEnd"/>
     </w:p>
     <w:p/>
-    <w:p>
-      <w:proofErr w:type="gramStart"/>
+    <w:p/>
+    <w:p>
+      <w:pPr>
+        <w:ind w:left="708"/>
+        <w:jc w:val="center"/>
+        <w:rPr>
+          <w:b/>
+          <w:bCs/>
+        </w:rPr>
+      </w:pPr>
+      <w:r>
+        <w:rPr>
+          <w:b/>
+          <w:bCs/>
+        </w:rPr>
+        <w:t xml:space="preserve">Creación de </w:t>
+      </w:r>
+      <w:proofErr w:type="spellStart"/>
+      <w:r>
+        <w:rPr>
+          <w:b/>
+          <w:bCs/>
+        </w:rPr>
+        <w:t>detalleMoto</w:t>
+      </w:r>
+      <w:proofErr w:type="spellEnd"/>
+    </w:p>
+    <w:p>
+      <w:pPr>
+        <w:ind w:left="708"/>
+      </w:pPr>
+      <w:r>
+        <w:t xml:space="preserve">Usamos el </w:t>
+      </w:r>
+      <w:proofErr w:type="spellStart"/>
+      <w:r>
+        <w:t>hook</w:t>
+      </w:r>
+      <w:proofErr w:type="spellEnd"/>
+      <w:r>
+        <w:t xml:space="preserve"> use </w:t>
+      </w:r>
+      <w:proofErr w:type="spellStart"/>
+      <w:r>
+        <w:t>params</w:t>
+      </w:r>
+      <w:proofErr w:type="spellEnd"/>
+      <w:r>
+        <w:t xml:space="preserve"> que sirve para leer el valor variable de la </w:t>
+      </w:r>
+      <w:proofErr w:type="spellStart"/>
+      <w:r>
+        <w:t>url</w:t>
+      </w:r>
+      <w:proofErr w:type="spellEnd"/>
+    </w:p>
+    <w:p>
+      <w:pPr>
+        <w:ind w:left="708"/>
+      </w:pPr>
+      <w:proofErr w:type="spellStart"/>
+      <w:r>
+        <w:t>useParams</w:t>
+      </w:r>
+      <w:proofErr w:type="spellEnd"/>
+      <w:r>
+        <w:t xml:space="preserve"> es un </w:t>
+      </w:r>
+      <w:proofErr w:type="spellStart"/>
+      <w:r>
+        <w:t>hook</w:t>
+      </w:r>
+      <w:proofErr w:type="spellEnd"/>
+      <w:r>
+        <w:t xml:space="preserve"> de </w:t>
+      </w:r>
+      <w:proofErr w:type="spellStart"/>
+      <w:r>
+        <w:rPr>
+          <w:b/>
+          <w:bCs/>
+        </w:rPr>
+        <w:t>React</w:t>
+      </w:r>
+      <w:proofErr w:type="spellEnd"/>
+      <w:r>
+        <w:rPr>
+          <w:b/>
+          <w:bCs/>
+        </w:rPr>
+        <w:t xml:space="preserve"> </w:t>
+      </w:r>
+      <w:proofErr w:type="spellStart"/>
+      <w:r>
+        <w:rPr>
+          <w:b/>
+          <w:bCs/>
+        </w:rPr>
+        <w:t>Router</w:t>
+      </w:r>
+      <w:proofErr w:type="spellEnd"/>
+      <w:r>
+        <w:t xml:space="preserve"> que sirve para </w:t>
+      </w:r>
+      <w:r>
+        <w:rPr>
+          <w:b/>
+          <w:bCs/>
+        </w:rPr>
+        <w:t>obtener los parámetros dinámicos que vienen en la URL</w:t>
+      </w:r>
+      <w:r>
+        <w:t>.</w:t>
+      </w:r>
+    </w:p>
+    <w:p>
+      <w:pPr>
+        <w:ind w:left="708"/>
+      </w:pPr>
+      <w:r>
+        <w:t>La idea principal es:</w:t>
+      </w:r>
+    </w:p>
+    <w:p>
+      <w:pPr>
+        <w:ind w:left="708"/>
+      </w:pPr>
+      <w:proofErr w:type="spellStart"/>
+      <w:r>
+        <w:rPr>
+          <w:b/>
+          <w:bCs/>
+        </w:rPr>
+        <w:t>useParams</w:t>
+      </w:r>
+      <w:proofErr w:type="spellEnd"/>
+      <w:r>
+        <w:rPr>
+          <w:b/>
+          <w:bCs/>
+        </w:rPr>
+        <w:t>() me permite leer una parte variable de la URL.</w:t>
+      </w:r>
+    </w:p>
+    <w:p>
+      <w:pPr>
+        <w:ind w:left="708"/>
+      </w:pPr>
+      <w:r>
+        <w:pict w14:anchorId="44313204">
+          <v:rect id="_x0000_i1025" style="width:0;height:1.5pt" o:hralign="center" o:hrstd="t" o:hr="t" fillcolor="#a0a0a0" stroked="f"/>
+        </w:pict>
+      </w:r>
+    </w:p>
+    <w:p>
+      <w:pPr>
+        <w:ind w:left="708"/>
+        <w:rPr>
+          <w:b/>
+          <w:bCs/>
+        </w:rPr>
+      </w:pPr>
+      <w:r>
+        <w:rPr>
+          <w:b/>
+          <w:bCs/>
+        </w:rPr>
+        <w:t>1. El problema que resuelve</w:t>
+      </w:r>
+    </w:p>
+    <w:p>
+      <w:pPr>
+        <w:ind w:left="708"/>
+      </w:pPr>
+      <w:r>
+        <w:t xml:space="preserve">Supongamos que </w:t>
+      </w:r>
+      <w:proofErr w:type="spellStart"/>
+      <w:r>
+        <w:t>tenés</w:t>
+      </w:r>
+      <w:proofErr w:type="spellEnd"/>
+      <w:r>
+        <w:t xml:space="preserve"> una página para mostrar un producto:</w:t>
+      </w:r>
+    </w:p>
+    <w:p>
+      <w:pPr>
+        <w:ind w:left="708"/>
+      </w:pPr>
+      <w:r>
+        <w:t>/productos/15</w:t>
+      </w:r>
+    </w:p>
+    <w:p>
+      <w:pPr>
+        <w:ind w:left="708"/>
+      </w:pPr>
+      <w:r>
+        <w:t>Y otra:</w:t>
+      </w:r>
+    </w:p>
+    <w:p>
+      <w:pPr>
+        <w:ind w:left="708"/>
+      </w:pPr>
+      <w:r>
+        <w:t>/productos/27</w:t>
+      </w:r>
+    </w:p>
+    <w:p>
+      <w:pPr>
+        <w:ind w:left="708"/>
+      </w:pPr>
+      <w:r>
+        <w:t xml:space="preserve">Queremos que </w:t>
+      </w:r>
+      <w:r>
+        <w:rPr>
+          <w:b/>
+          <w:bCs/>
+        </w:rPr>
+        <w:t>el mismo componente</w:t>
+      </w:r>
+      <w:r>
+        <w:t xml:space="preserve"> pueda mostrar el producto correspondiente al 15, al 27, etc.</w:t>
+      </w:r>
+    </w:p>
+    <w:p>
+      <w:pPr>
+        <w:ind w:left="708"/>
+      </w:pPr>
+      <w:r>
+        <w:t xml:space="preserve">Para eso usamos una </w:t>
+      </w:r>
+      <w:r>
+        <w:rPr>
+          <w:b/>
+          <w:bCs/>
+        </w:rPr>
+        <w:t>ruta dinámica</w:t>
+      </w:r>
+      <w:r>
+        <w:t>:</w:t>
+      </w:r>
+    </w:p>
+    <w:p>
+      <w:pPr>
+        <w:ind w:left="708"/>
+      </w:pPr>
+      <w:r>
+        <w:t>&lt;</w:t>
+      </w:r>
+      <w:proofErr w:type="spellStart"/>
+      <w:r>
+        <w:t>Route</w:t>
+      </w:r>
+      <w:proofErr w:type="spellEnd"/>
+      <w:r>
+        <w:t xml:space="preserve"> </w:t>
+      </w:r>
+      <w:proofErr w:type="spellStart"/>
+      <w:r>
+        <w:t>path</w:t>
+      </w:r>
+      <w:proofErr w:type="spellEnd"/>
+      <w:r>
+        <w:t xml:space="preserve">="/productos/:id" </w:t>
+      </w:r>
+      <w:proofErr w:type="spellStart"/>
+      <w:r>
+        <w:t>element</w:t>
+      </w:r>
+      <w:proofErr w:type="spellEnd"/>
+      <w:r>
+        <w:t>={&lt;Producto /&gt;} /&gt;</w:t>
+      </w:r>
+    </w:p>
+    <w:p>
+      <w:pPr>
+        <w:ind w:left="708"/>
+      </w:pPr>
+      <w:r>
+        <w:t>El :id significa:</w:t>
+      </w:r>
+    </w:p>
+    <w:p>
+      <w:pPr>
+        <w:ind w:left="708"/>
+      </w:pPr>
+      <w:r>
+        <w:t>"Acá va a venir un valor que puede cambiar".</w:t>
+      </w:r>
+    </w:p>
+    <w:p>
+      <w:pPr>
+        <w:ind w:left="708"/>
+      </w:pPr>
+      <w:r>
+        <w:pict w14:anchorId="2E5895A7">
+          <v:rect id="_x0000_i1026" style="width:0;height:1.5pt" o:hralign="center" o:hrstd="t" o:hr="t" fillcolor="#a0a0a0" stroked="f"/>
+        </w:pict>
+      </w:r>
+    </w:p>
+    <w:p>
+      <w:pPr>
+        <w:ind w:left="708"/>
+        <w:rPr>
+          <w:b/>
+          <w:bCs/>
+        </w:rPr>
+      </w:pPr>
+      <w:r>
+        <w:rPr>
+          <w:b/>
+          <w:bCs/>
+        </w:rPr>
+        <w:t xml:space="preserve">2. Obtener ese valor con </w:t>
+      </w:r>
+      <w:proofErr w:type="spellStart"/>
+      <w:r>
+        <w:rPr>
+          <w:b/>
+          <w:bCs/>
+        </w:rPr>
+        <w:t>useParams</w:t>
+      </w:r>
+      <w:proofErr w:type="spellEnd"/>
+    </w:p>
+    <w:p>
+      <w:pPr>
+        <w:ind w:left="708"/>
+      </w:pPr>
+      <w:r>
+        <w:t>En el componente Producto:</w:t>
+      </w:r>
+    </w:p>
+    <w:p>
+      <w:pPr>
+        <w:ind w:left="708"/>
+      </w:pPr>
+      <w:proofErr w:type="spellStart"/>
+      <w:r>
+        <w:t>import</w:t>
+      </w:r>
+      <w:proofErr w:type="spellEnd"/>
+      <w:r>
+        <w:t xml:space="preserve"> { </w:t>
+      </w:r>
+      <w:proofErr w:type="spellStart"/>
+      <w:r>
+        <w:t>useParams</w:t>
+      </w:r>
+      <w:proofErr w:type="spellEnd"/>
+      <w:r>
+        <w:t xml:space="preserve"> } </w:t>
+      </w:r>
+      <w:proofErr w:type="spellStart"/>
+      <w:r>
+        <w:t>from</w:t>
+      </w:r>
+      <w:proofErr w:type="spellEnd"/>
+      <w:r>
+        <w:t xml:space="preserve"> "</w:t>
+      </w:r>
+      <w:proofErr w:type="spellStart"/>
+      <w:r>
+        <w:t>react</w:t>
+      </w:r>
+      <w:proofErr w:type="spellEnd"/>
+      <w:r>
+        <w:t>-</w:t>
+      </w:r>
+      <w:proofErr w:type="spellStart"/>
+      <w:r>
+        <w:t>router</w:t>
+      </w:r>
+      <w:proofErr w:type="spellEnd"/>
+      <w:r>
+        <w:t>-dom";</w:t>
+      </w:r>
+    </w:p>
+    <w:p>
+      <w:pPr>
+        <w:ind w:left="708"/>
+      </w:pPr>
+    </w:p>
+    <w:p>
+      <w:pPr>
+        <w:ind w:left="708"/>
+      </w:pPr>
+      <w:proofErr w:type="spellStart"/>
       <w:r>
         <w:lastRenderedPageBreak/>
-        <w:t>Como se aplica?</w:t>
-      </w:r>
-      <w:proofErr w:type="gramEnd"/>
-    </w:p>
-    <w:p>
-      <w:r>
-        <w:t xml:space="preserve">Lo primero es en </w:t>
-      </w:r>
-      <w:proofErr w:type="spellStart"/>
-      <w:proofErr w:type="gramStart"/>
-      <w:r>
-        <w:t>app.jsx</w:t>
-      </w:r>
-      <w:proofErr w:type="spellEnd"/>
-      <w:r>
-        <w:t xml:space="preserve">  importar</w:t>
-      </w:r>
-      <w:proofErr w:type="gramEnd"/>
+        <w:t>function</w:t>
+      </w:r>
+      <w:proofErr w:type="spellEnd"/>
+      <w:r>
+        <w:t xml:space="preserve"> Producto() {</w:t>
+      </w:r>
+    </w:p>
+    <w:p>
+      <w:pPr>
+        <w:ind w:left="708"/>
+      </w:pPr>
+      <w:r>
+        <w:t xml:space="preserve">    </w:t>
+      </w:r>
+      <w:proofErr w:type="spellStart"/>
+      <w:r>
+        <w:t>const</w:t>
+      </w:r>
+      <w:proofErr w:type="spellEnd"/>
       <w:r>
         <w:t xml:space="preserve"> </w:t>
       </w:r>
       <w:proofErr w:type="spellStart"/>
       <w:r>
-        <w:t>routerprovider</w:t>
-      </w:r>
-      <w:proofErr w:type="spellEnd"/>
-      <w:r>
-        <w:t xml:space="preserve"> y </w:t>
-      </w:r>
-      <w:proofErr w:type="spellStart"/>
-      <w:r>
-        <w:t>router</w:t>
-      </w:r>
-      <w:proofErr w:type="spellEnd"/>
-      <w:r>
-        <w:t>.</w:t>
-      </w:r>
-    </w:p>
-    <w:p>
-      <w:r>
-        <w:t xml:space="preserve">Luego </w:t>
-      </w:r>
-      <w:r>
-        <w:t>&lt;</w:t>
-      </w:r>
-      <w:proofErr w:type="spellStart"/>
-      <w:r>
-        <w:t>RouterProvider</w:t>
-      </w:r>
-      <w:proofErr w:type="spellEnd"/>
-      <w:r>
-        <w:t xml:space="preserve"> </w:t>
-      </w:r>
-      <w:proofErr w:type="spellStart"/>
-      <w:r>
-        <w:t>router</w:t>
-      </w:r>
-      <w:proofErr w:type="spellEnd"/>
-      <w:r>
-        <w:t>={</w:t>
-      </w:r>
-      <w:proofErr w:type="spellStart"/>
-      <w:r>
-        <w:t>router</w:t>
-      </w:r>
-      <w:proofErr w:type="spellEnd"/>
-      <w:r>
-        <w:t>}&gt;&lt;/</w:t>
-      </w:r>
-      <w:proofErr w:type="spellStart"/>
-      <w:r>
-        <w:t>RouterProvider</w:t>
-      </w:r>
-      <w:proofErr w:type="spellEnd"/>
-      <w:r>
-        <w:t xml:space="preserve">&gt; {/**entrega el </w:t>
-      </w:r>
-      <w:proofErr w:type="spellStart"/>
-      <w:r>
-        <w:t>router</w:t>
-      </w:r>
-      <w:proofErr w:type="spellEnd"/>
-      <w:r>
-        <w:t xml:space="preserve"> a la </w:t>
-      </w:r>
-      <w:proofErr w:type="spellStart"/>
-      <w:r>
-        <w:t>aplicacion</w:t>
-      </w:r>
-      <w:proofErr w:type="spellEnd"/>
-      <w:r>
-        <w:t>*/}</w:t>
-      </w:r>
-    </w:p>
-    <w:p>
-      <w:pPr>
-        <w:rPr>
-          <w:b/>
-          <w:bCs/>
-        </w:rPr>
-      </w:pPr>
-      <w:r>
-        <w:t xml:space="preserve"> Y es lo único que tenemos dentro de </w:t>
-      </w:r>
-      <w:proofErr w:type="spellStart"/>
-      <w:r>
-        <w:t>app.jsx</w:t>
-      </w:r>
-      <w:proofErr w:type="spellEnd"/>
-      <w:r>
-        <w:t xml:space="preserve">, </w:t>
-      </w:r>
-      <w:r>
-        <w:rPr>
-          <w:b/>
-          <w:bCs/>
-        </w:rPr>
-        <w:t>NO SE TOCA MAS</w:t>
-      </w:r>
-    </w:p>
-    <w:p>
-      <w:pPr>
-        <w:rPr>
-          <w:b/>
-          <w:bCs/>
-        </w:rPr>
-      </w:pPr>
-      <w:r>
-        <w:rPr>
-          <w:b/>
-          <w:bCs/>
-        </w:rPr>
-        <w:t xml:space="preserve">2) En </w:t>
-      </w:r>
-      <w:proofErr w:type="spellStart"/>
-      <w:r>
-        <w:rPr>
-          <w:b/>
-          <w:bCs/>
-        </w:rPr>
-        <w:t>router.jsx</w:t>
-      </w:r>
-      <w:proofErr w:type="spellEnd"/>
-      <w:r>
-        <w:rPr>
-          <w:b/>
-          <w:bCs/>
-        </w:rPr>
-        <w:t xml:space="preserve"> </w:t>
-      </w:r>
-    </w:p>
-    <w:p>
-      <w:r>
-        <w:t xml:space="preserve">Importar </w:t>
-      </w:r>
-      <w:proofErr w:type="spellStart"/>
-      <w:r>
-        <w:t>createbrowserrouter</w:t>
-      </w:r>
-      <w:proofErr w:type="spellEnd"/>
-      <w:r>
-        <w:t xml:space="preserve">, </w:t>
-      </w:r>
-      <w:proofErr w:type="spellStart"/>
-      <w:r>
-        <w:t>layoutpublico</w:t>
-      </w:r>
-      <w:proofErr w:type="spellEnd"/>
-      <w:r>
-        <w:t xml:space="preserve"> y </w:t>
-      </w:r>
-      <w:proofErr w:type="gramStart"/>
-      <w:r>
-        <w:t>home(</w:t>
-      </w:r>
-      <w:proofErr w:type="gramEnd"/>
-      <w:r>
-        <w:t xml:space="preserve">Por ahora, ya que solo tengo esto, luego </w:t>
-      </w:r>
-      <w:proofErr w:type="spellStart"/>
-      <w:r>
-        <w:t>aca</w:t>
-      </w:r>
-      <w:proofErr w:type="spellEnd"/>
-      <w:r>
-        <w:t xml:space="preserve"> tengo que importar todos los otros componentes, por </w:t>
-      </w:r>
-      <w:proofErr w:type="spellStart"/>
-      <w:r>
-        <w:t>ej</w:t>
-      </w:r>
-      <w:proofErr w:type="spellEnd"/>
-      <w:r>
-        <w:t xml:space="preserve">: catalogo, plan de </w:t>
-      </w:r>
-      <w:proofErr w:type="spellStart"/>
-      <w:r>
-        <w:t>ahorro,etc</w:t>
-      </w:r>
-      <w:proofErr w:type="spellEnd"/>
-      <w:r>
-        <w:t>)</w:t>
-      </w:r>
-      <w:r>
-        <w:t xml:space="preserve"> </w:t>
-      </w:r>
-      <w:proofErr w:type="spellStart"/>
-      <w:r>
-        <w:t>Tambien</w:t>
-      </w:r>
-      <w:proofErr w:type="spellEnd"/>
-      <w:r>
-        <w:t xml:space="preserve"> </w:t>
-      </w:r>
-      <w:proofErr w:type="spellStart"/>
-      <w:r>
-        <w:t>aca</w:t>
-      </w:r>
-      <w:proofErr w:type="spellEnd"/>
-      <w:r>
-        <w:t xml:space="preserve"> deberíamos importar el </w:t>
-      </w:r>
-      <w:proofErr w:type="spellStart"/>
-      <w:r>
-        <w:t>layoutprivado</w:t>
-      </w:r>
-      <w:proofErr w:type="spellEnd"/>
-      <w:r>
-        <w:t xml:space="preserve">, el de </w:t>
-      </w:r>
-      <w:proofErr w:type="spellStart"/>
-      <w:r>
-        <w:t>gestor,etc</w:t>
-      </w:r>
-      <w:proofErr w:type="spellEnd"/>
-    </w:p>
-    <w:p/>
+        <w:t>params</w:t>
+      </w:r>
+      <w:proofErr w:type="spellEnd"/>
+      <w:r>
+        <w:t xml:space="preserve"> = </w:t>
+      </w:r>
+      <w:proofErr w:type="spellStart"/>
+      <w:r>
+        <w:t>useParams</w:t>
+      </w:r>
+      <w:proofErr w:type="spellEnd"/>
+      <w:r>
+        <w:t>();</w:t>
+      </w:r>
+    </w:p>
+    <w:p>
+      <w:pPr>
+        <w:ind w:left="708"/>
+      </w:pPr>
+    </w:p>
+    <w:p>
+      <w:pPr>
+        <w:ind w:left="708"/>
+      </w:pPr>
+      <w:r>
+        <w:t xml:space="preserve">    console.log(</w:t>
+      </w:r>
+      <w:proofErr w:type="spellStart"/>
+      <w:r>
+        <w:t>params</w:t>
+      </w:r>
+      <w:proofErr w:type="spellEnd"/>
+      <w:r>
+        <w:t>);</w:t>
+      </w:r>
+    </w:p>
+    <w:p>
+      <w:pPr>
+        <w:ind w:left="708"/>
+      </w:pPr>
+    </w:p>
+    <w:p>
+      <w:pPr>
+        <w:ind w:left="708"/>
+      </w:pPr>
+      <w:r>
+        <w:t xml:space="preserve">    </w:t>
+      </w:r>
+      <w:proofErr w:type="spellStart"/>
+      <w:r>
+        <w:t>return</w:t>
+      </w:r>
+      <w:proofErr w:type="spellEnd"/>
+      <w:r>
+        <w:t xml:space="preserve"> (</w:t>
+      </w:r>
+    </w:p>
+    <w:p>
+      <w:pPr>
+        <w:ind w:left="708"/>
+      </w:pPr>
+      <w:r>
+        <w:t xml:space="preserve">        &lt;h1&gt;Producto&lt;/h1&gt;</w:t>
+      </w:r>
+    </w:p>
+    <w:p>
+      <w:pPr>
+        <w:ind w:left="708"/>
+      </w:pPr>
+      <w:r>
+        <w:t xml:space="preserve">    );</w:t>
+      </w:r>
+    </w:p>
+    <w:p>
+      <w:pPr>
+        <w:ind w:left="708"/>
+      </w:pPr>
+      <w:r>
+        <w:t>}</w:t>
+      </w:r>
+    </w:p>
+    <w:p>
+      <w:pPr>
+        <w:ind w:left="708"/>
+      </w:pPr>
+    </w:p>
     <w:p/>
     <w:p/>
     <w:p/>

</xml_diff>

<commit_message>
se cambio el gitignore para que no se suban los node_modules
</commit_message>
<xml_diff>
--- a/Conceptos.docx
+++ b/Conceptos.docx
@@ -157,7 +157,15 @@
     </w:p>
     <w:p>
       <w:r>
-        <w:t>* **Visitante Público (Sin sesión):** Puede explorar la vidriera/catálogo, ver detalles de motos y consultar información general.</w:t>
+        <w:t>* **Visitante Público (Sin sesión</w:t>
+      </w:r>
+      <w:proofErr w:type="gramStart"/>
+      <w:r>
+        <w:t>):*</w:t>
+      </w:r>
+      <w:proofErr w:type="gramEnd"/>
+      <w:r>
+        <w:t>* Puede explorar la vidriera/catálogo, ver detalles de motos y consultar información general.</w:t>
       </w:r>
     </w:p>
     <w:p>
@@ -165,22 +173,62 @@
         <w:t xml:space="preserve">* **Cliente </w:t>
       </w:r>
       <w:proofErr w:type="spellStart"/>
+      <w:proofErr w:type="gramStart"/>
       <w:r>
         <w:t>Logueado</w:t>
       </w:r>
       <w:proofErr w:type="spellEnd"/>
       <w:r>
-        <w:t>:** Puede solicitar la reserva de una moto por 48hs y ver sus reservas activas.</w:t>
-      </w:r>
-    </w:p>
-    <w:p>
-      <w:r>
-        <w:t>* **Vendedor (Empleado):** Puede confirmar/rechazar reservas de clientes, registrar ventas directas en mostrador y consultar su historial de ventas y comisiones asociadas.</w:t>
-      </w:r>
-    </w:p>
-    <w:p>
-      <w:r>
-        <w:t>* **Administrador (Dueño):** Posee acceso total al sistema: gestión de usuarios/vendedores, control global de stock y acceso al **</w:t>
+        <w:t>:*</w:t>
+      </w:r>
+      <w:proofErr w:type="gramEnd"/>
+      <w:r>
+        <w:t>* Puede solicitar la reserva de una moto por 48hs y ver sus reservas activas.</w:t>
+      </w:r>
+      <w:r>
+        <w:t xml:space="preserve"> </w:t>
+      </w:r>
+      <w:proofErr w:type="gramStart"/>
+      <w:r>
+        <w:t>REVISAR!!!</w:t>
+      </w:r>
+      <w:proofErr w:type="gramEnd"/>
+      <w:r>
+        <w:t xml:space="preserve"> Me parece que no es necesario ya que para eso </w:t>
+      </w:r>
+      <w:proofErr w:type="spellStart"/>
+      <w:r>
+        <w:t>esta</w:t>
+      </w:r>
+      <w:proofErr w:type="spellEnd"/>
+      <w:r>
+        <w:t xml:space="preserve"> el formulario de toma de datos</w:t>
+      </w:r>
+    </w:p>
+    <w:p>
+      <w:r>
+        <w:t>* **Vendedor (Empleado</w:t>
+      </w:r>
+      <w:proofErr w:type="gramStart"/>
+      <w:r>
+        <w:t>):*</w:t>
+      </w:r>
+      <w:proofErr w:type="gramEnd"/>
+      <w:r>
+        <w:t>* Puede confirmar/rechazar reservas de clientes, registrar ventas directas en mostrador y consultar su historial de ventas y comisiones asociadas.</w:t>
+      </w:r>
+    </w:p>
+    <w:p>
+      <w:r>
+        <w:t>* **Administrador (Dueño</w:t>
+      </w:r>
+      <w:proofErr w:type="gramStart"/>
+      <w:r>
+        <w:t>):*</w:t>
+      </w:r>
+      <w:proofErr w:type="gramEnd"/>
+      <w:r>
+        <w:t>* Posee acceso total al sistema: gestión de usuarios/vendedores, control global de stock y acceso al **</w:t>
       </w:r>
       <w:proofErr w:type="spellStart"/>
       <w:r>
@@ -291,6 +339,7 @@
         <w:rPr>
           <w:noProof/>
         </w:rPr>
+        <w:lastRenderedPageBreak/>
         <w:drawing>
           <wp:inline distT="0" distB="0" distL="0" distR="0" wp14:anchorId="31DF16DC" wp14:editId="44534FCB">
             <wp:extent cx="5400040" cy="1047750"/>
@@ -333,7 +382,6 @@
         <w:ind w:left="708"/>
       </w:pPr>
       <w:r>
-        <w:lastRenderedPageBreak/>
         <w:t>Dentro de la zona privada, la navegación (</w:t>
       </w:r>
       <w:proofErr w:type="spellStart"/>
@@ -422,7 +470,15 @@
         <w:t>Administrador</w:t>
       </w:r>
       <w:r>
-        <w:t xml:space="preserve">, el menú le habilita además: </w:t>
+        <w:t xml:space="preserve">, el menú le </w:t>
+      </w:r>
+      <w:proofErr w:type="gramStart"/>
+      <w:r>
+        <w:t>habilita</w:t>
+      </w:r>
+      <w:proofErr w:type="gramEnd"/>
+      <w:r>
+        <w:t xml:space="preserve"> además: </w:t>
       </w:r>
       <w:proofErr w:type="spellStart"/>
       <w:r>
@@ -612,15 +668,7 @@
       </w:r>
       <w:proofErr w:type="spellEnd"/>
       <w:r>
-        <w:t xml:space="preserve">/panel </w:t>
-      </w:r>
-      <w:proofErr w:type="spellStart"/>
-      <w:r>
-        <w:t>y</w:t>
-      </w:r>
-      <w:proofErr w:type="spellEnd"/>
-      <w:r>
-        <w:t xml:space="preserve"> Integrante 3 en </w:t>
+        <w:t xml:space="preserve">/panel y Integrante 3 en </w:t>
       </w:r>
       <w:proofErr w:type="spellStart"/>
       <w:r>
@@ -717,6 +765,7 @@
           <w:bCs/>
         </w:rPr>
       </w:pPr>
+      <w:proofErr w:type="gramStart"/>
       <w:r>
         <w:rPr>
           <w:b/>
@@ -724,12 +773,14 @@
         </w:rPr>
         <w:t>Como se estructura el código?</w:t>
       </w:r>
-    </w:p>
-    <w:p>
-      <w:pPr>
-        <w:ind w:left="708"/>
-      </w:pPr>
-      <w:r>
+      <w:proofErr w:type="gramEnd"/>
+    </w:p>
+    <w:p>
+      <w:pPr>
+        <w:ind w:left="708"/>
+      </w:pPr>
+      <w:r>
+        <w:lastRenderedPageBreak/>
         <w:t xml:space="preserve">aplicamos la </w:t>
       </w:r>
       <w:r>
@@ -743,6 +794,7 @@
         <w:t xml:space="preserve"> </w:t>
       </w:r>
       <w:proofErr w:type="spellStart"/>
+      <w:proofErr w:type="gramStart"/>
       <w:r>
         <w:rPr>
           <w:b/>
@@ -761,6 +813,7 @@
         </w:rPr>
         <w:t>)</w:t>
       </w:r>
+      <w:proofErr w:type="gramEnd"/>
       <w:r>
         <w:t xml:space="preserve">. </w:t>
       </w:r>
@@ -777,6 +830,7 @@
           <w:bCs/>
         </w:rPr>
       </w:pPr>
+      <w:proofErr w:type="gramStart"/>
       <w:r>
         <w:rPr>
           <w:b/>
@@ -784,13 +838,13 @@
         </w:rPr>
         <w:t>Que va en cada una de las carpetas?</w:t>
       </w:r>
-    </w:p>
-    <w:p>
-      <w:pPr>
-        <w:ind w:left="708"/>
-      </w:pPr>
-      <w:r>
-        <w:lastRenderedPageBreak/>
+      <w:proofErr w:type="gramEnd"/>
+    </w:p>
+    <w:p>
+      <w:pPr>
+        <w:ind w:left="708"/>
+      </w:pPr>
+      <w:r>
         <w:t xml:space="preserve">Según el esquema de organización por funcionalidad (Nivel 3), la distribución de responsabilidades para esas carpetas dentro de </w:t>
       </w:r>
       <w:proofErr w:type="spellStart"/>
@@ -852,7 +906,15 @@
         <w:ind w:left="708"/>
       </w:pPr>
       <w:r>
-        <w:t xml:space="preserve">Por ejemplo las imágenes de carrusel van </w:t>
+        <w:t xml:space="preserve">Por </w:t>
+      </w:r>
+      <w:proofErr w:type="gramStart"/>
+      <w:r>
+        <w:t>ejemplo</w:t>
+      </w:r>
+      <w:proofErr w:type="gramEnd"/>
+      <w:r>
+        <w:t xml:space="preserve"> las imágenes de carrusel van </w:t>
       </w:r>
       <w:proofErr w:type="spellStart"/>
       <w:r>
@@ -870,8 +932,13 @@
       <w:pPr>
         <w:ind w:left="708"/>
       </w:pPr>
-      <w:r>
-        <w:t xml:space="preserve">  Si el carrusel es parte de la maquetación fija (por ejemplo, banners promocionales fijos o una sección </w:t>
+      <w:proofErr w:type="gramStart"/>
+      <w:r>
+        <w:t>  Si</w:t>
+      </w:r>
+      <w:proofErr w:type="gramEnd"/>
+      <w:r>
+        <w:t xml:space="preserve"> el carrusel es parte de la maquetación fija (por ejemplo, banners promocionales fijos o una sección </w:t>
       </w:r>
       <w:proofErr w:type="spellStart"/>
       <w:r>
@@ -886,6 +953,7 @@
       <w:pPr>
         <w:ind w:left="708"/>
       </w:pPr>
+      <w:proofErr w:type="gramStart"/>
       <w:r>
         <w:t xml:space="preserve">  </w:t>
       </w:r>
@@ -894,7 +962,15 @@
           <w:b/>
           <w:bCs/>
         </w:rPr>
-        <w:t>Por qué:</w:t>
+        <w:t>Por</w:t>
+      </w:r>
+      <w:proofErr w:type="gramEnd"/>
+      <w:r>
+        <w:rPr>
+          <w:b/>
+          <w:bCs/>
+        </w:rPr>
+        <w:t xml:space="preserve"> qué:</w:t>
       </w:r>
       <w:r>
         <w:t xml:space="preserve"> Al importarlas dentro de tu componente (ejemplo: </w:t>
@@ -1224,6 +1300,7 @@
           <w:bCs/>
         </w:rPr>
       </w:pPr>
+      <w:proofErr w:type="gramStart"/>
       <w:r>
         <w:rPr>
           <w:b/>
@@ -1231,6 +1308,7 @@
         </w:rPr>
         <w:t>Donde van los JSON?</w:t>
       </w:r>
+      <w:proofErr w:type="gramEnd"/>
     </w:p>
     <w:p>
       <w:pPr>
@@ -1261,7 +1339,11 @@
       </w:r>
       <w:proofErr w:type="spellEnd"/>
       <w:r>
-        <w:t xml:space="preserve"> llamada data/</w:t>
+        <w:t xml:space="preserve"> llamada </w:t>
+      </w:r>
+      <w:proofErr w:type="gramStart"/>
+      <w:r>
+        <w:t>data/</w:t>
       </w:r>
       <w:proofErr w:type="spellStart"/>
       <w:r>
@@ -1274,6 +1356,7 @@
       <w:r>
         <w:t>,</w:t>
       </w:r>
+      <w:proofErr w:type="gramEnd"/>
       <w:r>
         <w:t xml:space="preserve"> </w:t>
       </w:r>
@@ -1304,6 +1387,7 @@
       <w:pPr>
         <w:ind w:left="708"/>
       </w:pPr>
+      <w:proofErr w:type="gramStart"/>
       <w:r>
         <w:t xml:space="preserve">  </w:t>
       </w:r>
@@ -1312,7 +1396,15 @@
           <w:b/>
           <w:bCs/>
         </w:rPr>
-        <w:t>Consumo a través de servicios:</w:t>
+        <w:t>Consumo</w:t>
+      </w:r>
+      <w:proofErr w:type="gramEnd"/>
+      <w:r>
+        <w:rPr>
+          <w:b/>
+          <w:bCs/>
+        </w:rPr>
+        <w:t xml:space="preserve"> a través de servicios:</w:t>
       </w:r>
       <w:r>
         <w:t xml:space="preserve"> En </w:t>
@@ -1357,6 +1449,7 @@
       <w:pPr>
         <w:ind w:left="708"/>
       </w:pPr>
+      <w:proofErr w:type="gramStart"/>
       <w:r>
         <w:t xml:space="preserve">  </w:t>
       </w:r>
@@ -1365,7 +1458,15 @@
           <w:b/>
           <w:bCs/>
         </w:rPr>
-        <w:t>Transición a producción sin tocar la interfaz:</w:t>
+        <w:t>Transición</w:t>
+      </w:r>
+      <w:proofErr w:type="gramEnd"/>
+      <w:r>
+        <w:rPr>
+          <w:b/>
+          <w:bCs/>
+        </w:rPr>
+        <w:t xml:space="preserve"> a producción sin tocar la interfaz:</w:t>
       </w:r>
       <w:r>
         <w:t xml:space="preserve"> Mientras el </w:t>
@@ -1554,7 +1655,15 @@
     </w:p>
     <w:p>
       <w:r>
-        <w:t xml:space="preserve">Uso [ ] para definir un arreglo y { } para definir un objeto, en la sintaxis </w:t>
+        <w:t xml:space="preserve">Uso </w:t>
+      </w:r>
+      <w:proofErr w:type="gramStart"/>
+      <w:r>
+        <w:t>[ ]</w:t>
+      </w:r>
+      <w:proofErr w:type="gramEnd"/>
+      <w:r>
+        <w:t xml:space="preserve"> para definir un arreglo y { } para definir un objeto, en la sintaxis </w:t>
       </w:r>
       <w:proofErr w:type="spellStart"/>
       <w:r>
@@ -1688,8 +1797,13 @@
       </w:r>
     </w:p>
     <w:p>
-      <w:r>
-        <w:t>Para que sirve? se carga una sola vez y, a partir de ahí, JavaScript se encarga de cambiar lo que se ve en pantalla sin</w:t>
+      <w:proofErr w:type="gramStart"/>
+      <w:r>
+        <w:t>Para que sirve?</w:t>
+      </w:r>
+      <w:proofErr w:type="gramEnd"/>
+      <w:r>
+        <w:t xml:space="preserve"> se carga una sola vez y, a partir de ahí, JavaScript se encarga de cambiar lo que se ve en pantalla sin</w:t>
       </w:r>
     </w:p>
     <w:p>
@@ -1723,7 +1837,15 @@
       </w:r>
       <w:proofErr w:type="spellEnd"/>
       <w:r>
-        <w:t>} para mostrar contenido, ahora esto cambia, y pasamos a usar(hay que importarlo) el componente {outlet}</w:t>
+        <w:t xml:space="preserve">} para mostrar contenido, ahora esto cambia, y pasamos a </w:t>
+      </w:r>
+      <w:proofErr w:type="gramStart"/>
+      <w:r>
+        <w:t>usar(</w:t>
+      </w:r>
+      <w:proofErr w:type="gramEnd"/>
+      <w:r>
+        <w:t>hay que importarlo) el componente {outlet}</w:t>
       </w:r>
     </w:p>
     <w:p>
@@ -1757,21 +1879,28 @@
     </w:p>
     <w:p/>
     <w:p>
+      <w:proofErr w:type="gramStart"/>
       <w:r>
         <w:t>Como se aplica?</w:t>
       </w:r>
+      <w:proofErr w:type="gramEnd"/>
     </w:p>
     <w:p>
       <w:r>
         <w:t xml:space="preserve">Lo primero es en </w:t>
       </w:r>
       <w:proofErr w:type="spellStart"/>
+      <w:proofErr w:type="gramStart"/>
       <w:r>
         <w:t>app.jsx</w:t>
       </w:r>
       <w:proofErr w:type="spellEnd"/>
       <w:r>
-        <w:t xml:space="preserve">  importar </w:t>
+        <w:t xml:space="preserve">  importar</w:t>
+      </w:r>
+      <w:proofErr w:type="gramEnd"/>
+      <w:r>
+        <w:t xml:space="preserve"> </w:t>
       </w:r>
       <w:proofErr w:type="spellStart"/>
       <w:r>
@@ -1922,7 +2051,15 @@
       </w:r>
       <w:proofErr w:type="spellEnd"/>
       <w:r>
-        <w:t xml:space="preserve"> y home(Por ahora, ya que solo tengo esto, luego </w:t>
+        <w:t xml:space="preserve"> y </w:t>
+      </w:r>
+      <w:proofErr w:type="gramStart"/>
+      <w:r>
+        <w:t>home(</w:t>
+      </w:r>
+      <w:proofErr w:type="gramEnd"/>
+      <w:r>
+        <w:t xml:space="preserve">Por ahora, ya que solo tengo esto, luego </w:t>
       </w:r>
       <w:proofErr w:type="spellStart"/>
       <w:r>
@@ -2110,6 +2247,7 @@
         <w:ind w:left="708"/>
       </w:pPr>
       <w:proofErr w:type="spellStart"/>
+      <w:proofErr w:type="gramStart"/>
       <w:r>
         <w:rPr>
           <w:b/>
@@ -2123,7 +2261,15 @@
           <w:b/>
           <w:bCs/>
         </w:rPr>
-        <w:t>() me permite leer una parte variable de la URL.</w:t>
+        <w:t>(</w:t>
+      </w:r>
+      <w:proofErr w:type="gramEnd"/>
+      <w:r>
+        <w:rPr>
+          <w:b/>
+          <w:bCs/>
+        </w:rPr>
+        <w:t>) me permite leer una parte variable de la URL.</w:t>
       </w:r>
     </w:p>
     <w:p>
@@ -2256,16 +2402,26 @@
         <w:t>element</w:t>
       </w:r>
       <w:proofErr w:type="spellEnd"/>
-      <w:r>
-        <w:t>={&lt;Producto /&gt;} /&gt;</w:t>
-      </w:r>
-    </w:p>
-    <w:p>
-      <w:pPr>
-        <w:ind w:left="708"/>
-      </w:pPr>
-      <w:r>
-        <w:t>El :id significa:</w:t>
+      <w:proofErr w:type="gramStart"/>
+      <w:r>
+        <w:t>={</w:t>
+      </w:r>
+      <w:proofErr w:type="gramEnd"/>
+      <w:r>
+        <w:t>&lt;Producto /&gt;} /&gt;</w:t>
+      </w:r>
+    </w:p>
+    <w:p>
+      <w:pPr>
+        <w:ind w:left="708"/>
+      </w:pPr>
+      <w:proofErr w:type="gramStart"/>
+      <w:r>
+        <w:t>El :id</w:t>
+      </w:r>
+      <w:proofErr w:type="gramEnd"/>
+      <w:r>
+        <w:t xml:space="preserve"> significa:</w:t>
       </w:r>
     </w:p>
     <w:p>
@@ -2329,13 +2485,18 @@
       </w:r>
       <w:proofErr w:type="spellEnd"/>
       <w:r>
-        <w:t xml:space="preserve"> { </w:t>
+        <w:t xml:space="preserve"> </w:t>
+      </w:r>
+      <w:proofErr w:type="gramStart"/>
+      <w:r>
+        <w:t xml:space="preserve">{ </w:t>
       </w:r>
       <w:proofErr w:type="spellStart"/>
       <w:r>
         <w:t>useParams</w:t>
       </w:r>
       <w:proofErr w:type="spellEnd"/>
+      <w:proofErr w:type="gramEnd"/>
       <w:r>
         <w:t xml:space="preserve"> } </w:t>
       </w:r>
@@ -2380,7 +2541,15 @@
       </w:r>
       <w:proofErr w:type="spellEnd"/>
       <w:r>
-        <w:t xml:space="preserve"> Producto() {</w:t>
+        <w:t xml:space="preserve"> </w:t>
+      </w:r>
+      <w:proofErr w:type="gramStart"/>
+      <w:r>
+        <w:t>Producto(</w:t>
+      </w:r>
+      <w:proofErr w:type="gramEnd"/>
+      <w:r>
+        <w:t>) {</w:t>
       </w:r>
     </w:p>
     <w:p>
@@ -2407,12 +2576,17 @@
         <w:t xml:space="preserve"> = </w:t>
       </w:r>
       <w:proofErr w:type="spellStart"/>
+      <w:proofErr w:type="gramStart"/>
       <w:r>
         <w:t>useParams</w:t>
       </w:r>
       <w:proofErr w:type="spellEnd"/>
       <w:r>
-        <w:t>();</w:t>
+        <w:t>(</w:t>
+      </w:r>
+      <w:proofErr w:type="gramEnd"/>
+      <w:r>
+        <w:t>);</w:t>
       </w:r>
     </w:p>
     <w:p>
@@ -3860,6 +4034,7 @@
   <w:style w:type="character" w:default="1" w:styleId="Fuentedeprrafopredeter">
     <w:name w:val="Default Paragraph Font"/>
     <w:uiPriority w:val="1"/>
+    <w:semiHidden/>
     <w:unhideWhenUsed/>
   </w:style>
   <w:style w:type="table" w:default="1" w:styleId="Tablanormal">

</xml_diff>